<commit_message>
2000 words atm, starting lit review
</commit_message>
<xml_diff>
--- a/[Vennce Bravo - 231402264] 25-26 Project Interim Report Template .docx
+++ b/[Vennce Bravo - 231402264] 25-26 Project Interim Report Template .docx
@@ -52,7 +52,7 @@
         <mc:AlternateContent>
           <mc:Choice Requires="wps">
             <w:drawing>
-              <wp:anchor distT="0" distB="0" distL="114300" distR="114300" simplePos="0" relativeHeight="251659264" behindDoc="0" locked="0" layoutInCell="1" allowOverlap="1" wp14:anchorId="364215C2" wp14:editId="4B56C722">
+              <wp:anchor distT="0" distB="0" distL="114300" distR="114300" simplePos="0" relativeHeight="251658240" behindDoc="0" locked="0" layoutInCell="1" allowOverlap="1" wp14:anchorId="364215C2" wp14:editId="4B56C722">
                 <wp:simplePos x="0" y="0"/>
                 <wp:positionH relativeFrom="margin">
                   <wp:posOffset>40640</wp:posOffset>
@@ -125,7 +125,7 @@
           </mc:Choice>
           <mc:Fallback>
             <w:pict>
-              <v:line w14:anchorId="194569DB" id="Straight Connector 12" o:spid="_x0000_s1026" style="position:absolute;z-index:251659264;visibility:visible;mso-wrap-style:square;mso-width-percent:0;mso-height-percent:0;mso-wrap-distance-left:9pt;mso-wrap-distance-top:0;mso-wrap-distance-right:9pt;mso-wrap-distance-bottom:0;mso-position-horizontal:absolute;mso-position-horizontal-relative:margin;mso-position-vertical:absolute;mso-position-vertical-relative:text;mso-width-percent:0;mso-height-percent:0;mso-width-relative:margin;mso-height-relative:margin" from="3.2pt,9.85pt" to="456.7pt,9.85pt" o:gfxdata="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" strokecolor="#0e2841 [3215]" strokeweight="2.25pt">
+              <v:line w14:anchorId="317FDC03" id="Straight Connector 12" o:spid="_x0000_s1026" style="position:absolute;z-index:251658240;visibility:visible;mso-wrap-style:square;mso-width-percent:0;mso-height-percent:0;mso-wrap-distance-left:9pt;mso-wrap-distance-top:0;mso-wrap-distance-right:9pt;mso-wrap-distance-bottom:0;mso-position-horizontal:absolute;mso-position-horizontal-relative:margin;mso-position-vertical:absolute;mso-position-vertical-relative:text;mso-width-percent:0;mso-height-percent:0;mso-width-relative:margin;mso-height-relative:margin" from="3.2pt,9.85pt" to="456.7pt,9.85pt" o:gfxdata="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" strokecolor="#0e2841 [3215]" strokeweight="2.25pt">
                 <v:stroke dashstyle="dash" opacity="50372f" linestyle="thinThin" endcap="round"/>
                 <v:shadow on="t" color="black" opacity="26214f" origin=",-.5" offset="0,3pt"/>
                 <w10:wrap anchorx="margin"/>
@@ -332,7 +332,7 @@
         <mc:AlternateContent>
           <mc:Choice Requires="wps">
             <w:drawing>
-              <wp:anchor distT="0" distB="0" distL="114300" distR="114300" simplePos="0" relativeHeight="251661312" behindDoc="0" locked="0" layoutInCell="1" allowOverlap="1" wp14:anchorId="4117DE75" wp14:editId="5B225311">
+              <wp:anchor distT="0" distB="0" distL="114300" distR="114300" simplePos="0" relativeHeight="251658241" behindDoc="0" locked="0" layoutInCell="1" allowOverlap="1" wp14:anchorId="4117DE75" wp14:editId="5B225311">
                 <wp:simplePos x="0" y="0"/>
                 <wp:positionH relativeFrom="margin">
                   <wp:posOffset>48260</wp:posOffset>
@@ -405,7 +405,7 @@
           </mc:Choice>
           <mc:Fallback>
             <w:pict>
-              <v:line w14:anchorId="710AC438" id="Straight Connector 12" o:spid="_x0000_s1026" style="position:absolute;z-index:251661312;visibility:visible;mso-wrap-style:square;mso-width-percent:0;mso-height-percent:0;mso-wrap-distance-left:9pt;mso-wrap-distance-top:0;mso-wrap-distance-right:9pt;mso-wrap-distance-bottom:0;mso-position-horizontal:absolute;mso-position-horizontal-relative:margin;mso-position-vertical:absolute;mso-position-vertical-relative:text;mso-width-percent:0;mso-height-percent:0;mso-width-relative:margin;mso-height-relative:margin" from="3.8pt,24.3pt" to="457.3pt,24.3pt" o:gfxdata="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" strokecolor="#0e2841 [3215]" strokeweight="2.25pt">
+              <v:line w14:anchorId="53AA6C65" id="Straight Connector 12" o:spid="_x0000_s1026" style="position:absolute;z-index:251658241;visibility:visible;mso-wrap-style:square;mso-width-percent:0;mso-height-percent:0;mso-wrap-distance-left:9pt;mso-wrap-distance-top:0;mso-wrap-distance-right:9pt;mso-wrap-distance-bottom:0;mso-position-horizontal:absolute;mso-position-horizontal-relative:margin;mso-position-vertical:absolute;mso-position-vertical-relative:text;mso-width-percent:0;mso-height-percent:0;mso-width-relative:margin;mso-height-relative:margin" from="3.8pt,24.3pt" to="457.3pt,24.3pt" o:gfxdata="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" strokecolor="#0e2841 [3215]" strokeweight="2.25pt">
                 <v:stroke dashstyle="dash" opacity="50372f" linestyle="thinThin" endcap="round"/>
                 <v:shadow on="t" color="black" opacity="26214f" origin=",-.5" offset="0,3pt"/>
                 <w10:wrap anchorx="margin"/>
@@ -668,7 +668,7 @@
     <w:sdt>
       <w:sdtPr>
         <w:rPr>
-          <w:rFonts w:asciiTheme="minorHAnsi" w:eastAsiaTheme="minorHAnsi" w:hAnsiTheme="minorHAnsi" w:cstheme="minorBidi"/>
+          <w:rFonts w:asciiTheme="minorHAnsi" w:eastAsiaTheme="minorEastAsia" w:hAnsiTheme="minorHAnsi" w:cstheme="minorBidi"/>
           <w:color w:val="auto"/>
           <w:kern w:val="2"/>
           <w:sz w:val="24"/>
@@ -685,8 +685,6 @@
       <w:sdtEndPr>
         <w:rPr>
           <w:b/>
-          <w:bCs/>
-          <w:noProof/>
         </w:rPr>
       </w:sdtEndPr>
       <w:sdtContent>
@@ -3085,7 +3083,7 @@
           <w:sz w:val="22"/>
           <w:szCs w:val="22"/>
         </w:rPr>
-        <w:t xml:space="preserve">The project aims to explore the balance of comfortability and the cost of difficulty </w:t>
+        <w:t xml:space="preserve">The project aims to explore </w:t>
       </w:r>
       <w:r>
         <w:rPr>
@@ -3093,7 +3091,71 @@
           <w:sz w:val="22"/>
           <w:szCs w:val="22"/>
         </w:rPr>
-        <w:t>present within cozy games. It also aims to be able to identify what aspects of a game creates the cozy game identity.</w:t>
+        <w:t xml:space="preserve">how the </w:t>
+      </w:r>
+      <w:r>
+        <w:rPr>
+          <w:rFonts w:ascii="Arial" w:hAnsi="Arial" w:cs="Arial"/>
+          <w:sz w:val="22"/>
+          <w:szCs w:val="22"/>
+        </w:rPr>
+        <w:t>different levels of</w:t>
+      </w:r>
+      <w:r>
+        <w:rPr>
+          <w:rFonts w:ascii="Arial" w:hAnsi="Arial" w:cs="Arial"/>
+          <w:sz w:val="22"/>
+          <w:szCs w:val="22"/>
+        </w:rPr>
+        <w:t xml:space="preserve"> difficulty </w:t>
+      </w:r>
+      <w:r>
+        <w:rPr>
+          <w:rFonts w:ascii="Arial" w:hAnsi="Arial" w:cs="Arial"/>
+          <w:sz w:val="22"/>
+          <w:szCs w:val="22"/>
+        </w:rPr>
+        <w:t>affect</w:t>
+      </w:r>
+      <w:r>
+        <w:rPr>
+          <w:rFonts w:ascii="Arial" w:hAnsi="Arial" w:cs="Arial"/>
+          <w:sz w:val="22"/>
+          <w:szCs w:val="22"/>
+        </w:rPr>
+        <w:t xml:space="preserve"> the core identity of the cozy game genre</w:t>
+      </w:r>
+      <w:r>
+        <w:rPr>
+          <w:rFonts w:ascii="Arial" w:hAnsi="Arial" w:cs="Arial"/>
+          <w:sz w:val="22"/>
+          <w:szCs w:val="22"/>
+        </w:rPr>
+        <w:t xml:space="preserve">. This will be done through a </w:t>
+      </w:r>
+      <w:r>
+        <w:rPr>
+          <w:rFonts w:ascii="Arial" w:hAnsi="Arial" w:cs="Arial"/>
+          <w:sz w:val="22"/>
+          <w:szCs w:val="22"/>
+        </w:rPr>
+        <w:t xml:space="preserve">playtesting period and a </w:t>
+      </w:r>
+      <w:r>
+        <w:rPr>
+          <w:rFonts w:ascii="Arial" w:hAnsi="Arial" w:cs="Arial"/>
+          <w:sz w:val="22"/>
+          <w:szCs w:val="22"/>
+        </w:rPr>
+        <w:t>survey-based user study</w:t>
+      </w:r>
+      <w:r>
+        <w:rPr>
+          <w:rFonts w:ascii="Arial" w:hAnsi="Arial" w:cs="Arial"/>
+          <w:sz w:val="22"/>
+          <w:szCs w:val="22"/>
+        </w:rPr>
+        <w:t>.</w:t>
       </w:r>
     </w:p>
     <w:p>
@@ -4008,17 +4070,280 @@
       <w:bookmarkEnd w:id="25"/>
     </w:p>
     <w:p>
-      <w:pPr>
-        <w:rPr>
-          <w:rFonts w:ascii="Arial" w:hAnsi="Arial" w:cs="Arial"/>
-        </w:rPr>
-      </w:pPr>
-      <w:r>
-        <w:t>This project will use both a Kanban board and</w:t>
-      </w:r>
-      <w:r>
-        <w:t xml:space="preserve"> Gantt chart to help visualise and break down tasks into sizable chunks to be done.</w:t>
-      </w:r>
+      <w:r>
+        <w:t xml:space="preserve">This project will span </w:t>
+      </w:r>
+      <w:r>
+        <w:t xml:space="preserve">from </w:t>
+      </w:r>
+      <w:r>
+        <w:t>September 2025</w:t>
+      </w:r>
+      <w:r>
+        <w:t xml:space="preserve"> to May 202</w:t>
+      </w:r>
+      <w:r>
+        <w:t>6</w:t>
+      </w:r>
+      <w:r>
+        <w:t xml:space="preserve">. </w:t>
+      </w:r>
+      <w:r>
+        <w:t>A combination of a Gantt Chart and a Kanban Board will be used to manage time and workflow effectively.</w:t>
+      </w:r>
+    </w:p>
+    <w:p>
+      <w:r>
+        <w:t>The Gantt Chart (</w:t>
+      </w:r>
+      <w:r>
+        <w:t>Fig</w:t>
+      </w:r>
+      <w:r>
+        <w:t xml:space="preserve"> 1.1</w:t>
+      </w:r>
+      <w:r>
+        <w:t>) provides a visual representation of the overall timeline, illustrating task durations and milestones. This will help ensure that major phases throughout the project</w:t>
+      </w:r>
+      <w:r>
+        <w:t xml:space="preserve"> are completed on schedule.</w:t>
+      </w:r>
+    </w:p>
+    <w:p>
+      <w:r>
+        <w:drawing>
+          <wp:inline distT="0" distB="0" distL="0" distR="0" wp14:anchorId="6748446F" wp14:editId="0BEAE7CF">
+            <wp:extent cx="5305425" cy="2090878"/>
+            <wp:effectExtent l="0" t="0" r="0" b="5080"/>
+            <wp:docPr id="465811076" name="Picture 1" descr="A graph with multiple colored squares&#10;&#10;AI-generated content may be incorrect."/>
+            <wp:cNvGraphicFramePr>
+              <a:graphicFrameLocks xmlns:a="http://schemas.openxmlformats.org/drawingml/2006/main" noChangeAspect="1"/>
+            </wp:cNvGraphicFramePr>
+            <a:graphic xmlns:a="http://schemas.openxmlformats.org/drawingml/2006/main">
+              <a:graphicData uri="http://schemas.openxmlformats.org/drawingml/2006/picture">
+                <pic:pic xmlns:pic="http://schemas.openxmlformats.org/drawingml/2006/picture">
+                  <pic:nvPicPr>
+                    <pic:cNvPr id="465811076" name="Picture 1" descr="A graph with multiple colored squares&#10;&#10;AI-generated content may be incorrect."/>
+                    <pic:cNvPicPr/>
+                  </pic:nvPicPr>
+                  <pic:blipFill>
+                    <a:blip r:embed="rId11"/>
+                    <a:stretch>
+                      <a:fillRect/>
+                    </a:stretch>
+                  </pic:blipFill>
+                  <pic:spPr>
+                    <a:xfrm>
+                      <a:off x="0" y="0"/>
+                      <a:ext cx="5351827" cy="2109165"/>
+                    </a:xfrm>
+                    <a:prstGeom prst="rect">
+                      <a:avLst/>
+                    </a:prstGeom>
+                  </pic:spPr>
+                </pic:pic>
+              </a:graphicData>
+            </a:graphic>
+          </wp:inline>
+        </w:drawing>
+      </w:r>
+    </w:p>
+    <w:p>
+      <w:pPr>
+        <w:rPr>
+          <w:sz w:val="16"/>
+          <w:szCs w:val="16"/>
+        </w:rPr>
+      </w:pPr>
+      <w:r>
+        <w:rPr>
+          <w:sz w:val="16"/>
+          <w:szCs w:val="16"/>
+        </w:rPr>
+        <w:t xml:space="preserve">Fig </w:t>
+      </w:r>
+      <w:r>
+        <w:rPr>
+          <w:sz w:val="16"/>
+          <w:szCs w:val="16"/>
+        </w:rPr>
+        <w:t>1</w:t>
+      </w:r>
+      <w:r>
+        <w:rPr>
+          <w:sz w:val="16"/>
+          <w:szCs w:val="16"/>
+        </w:rPr>
+        <w:t>.1</w:t>
+      </w:r>
+      <w:r>
+        <w:rPr>
+          <w:sz w:val="16"/>
+          <w:szCs w:val="16"/>
+        </w:rPr>
+        <w:t>: Example of Gantt Chart</w:t>
+      </w:r>
+    </w:p>
+    <w:p>
+      <w:r>
+        <w:t>The Kanban board</w:t>
+      </w:r>
+      <w:r>
+        <w:t xml:space="preserve"> (Fig 1.2)</w:t>
+      </w:r>
+      <w:r>
+        <w:t xml:space="preserve"> will be in harmony with the Gantt Chart by providing a </w:t>
+      </w:r>
+      <w:r>
+        <w:t>real-time view of</w:t>
+      </w:r>
+      <w:r>
+        <w:t xml:space="preserve"> ongoing</w:t>
+      </w:r>
+      <w:r>
+        <w:t xml:space="preserve"> tasks and the progression status. This </w:t>
+      </w:r>
+      <w:r>
+        <w:t xml:space="preserve">approach </w:t>
+      </w:r>
+      <w:r>
+        <w:t>ensures that there is continuous workflow</w:t>
+      </w:r>
+      <w:r>
+        <w:t>,</w:t>
+      </w:r>
+      <w:r>
+        <w:t xml:space="preserve"> whilst also allowing for task prioritisation</w:t>
+      </w:r>
+      <w:r>
+        <w:t xml:space="preserve">, </w:t>
+      </w:r>
+      <w:r>
+        <w:t xml:space="preserve">scope control </w:t>
+      </w:r>
+      <w:r>
+        <w:t>and blocking</w:t>
+      </w:r>
+      <w:r>
+        <w:t xml:space="preserve"> </w:t>
+      </w:r>
+      <w:r>
+        <w:t xml:space="preserve">of </w:t>
+      </w:r>
+      <w:r>
+        <w:t>tasks.</w:t>
+      </w:r>
+    </w:p>
+    <w:p>
+      <w:r>
+        <w:drawing>
+          <wp:inline distT="0" distB="0" distL="0" distR="0" wp14:anchorId="3572E752" wp14:editId="6EC57C3A">
+            <wp:extent cx="5474335" cy="3065145"/>
+            <wp:effectExtent l="0" t="0" r="0" b="1905"/>
+            <wp:docPr id="1240442444" name="Picture 1" descr="A screenshot of a computer screen&#10;&#10;AI-generated content may be incorrect."/>
+            <wp:cNvGraphicFramePr>
+              <a:graphicFrameLocks xmlns:a="http://schemas.openxmlformats.org/drawingml/2006/main" noChangeAspect="1"/>
+            </wp:cNvGraphicFramePr>
+            <a:graphic xmlns:a="http://schemas.openxmlformats.org/drawingml/2006/main">
+              <a:graphicData uri="http://schemas.openxmlformats.org/drawingml/2006/picture">
+                <pic:pic xmlns:pic="http://schemas.openxmlformats.org/drawingml/2006/picture">
+                  <pic:nvPicPr>
+                    <pic:cNvPr id="1240442444" name="Picture 1" descr="A screenshot of a computer screen&#10;&#10;AI-generated content may be incorrect."/>
+                    <pic:cNvPicPr/>
+                  </pic:nvPicPr>
+                  <pic:blipFill>
+                    <a:blip r:embed="rId12"/>
+                    <a:stretch>
+                      <a:fillRect/>
+                    </a:stretch>
+                  </pic:blipFill>
+                  <pic:spPr>
+                    <a:xfrm>
+                      <a:off x="0" y="0"/>
+                      <a:ext cx="5474335" cy="3065145"/>
+                    </a:xfrm>
+                    <a:prstGeom prst="rect">
+                      <a:avLst/>
+                    </a:prstGeom>
+                  </pic:spPr>
+                </pic:pic>
+              </a:graphicData>
+            </a:graphic>
+          </wp:inline>
+        </w:drawing>
+      </w:r>
+    </w:p>
+    <w:p>
+      <w:pPr>
+        <w:rPr>
+          <w:sz w:val="16"/>
+          <w:szCs w:val="16"/>
+        </w:rPr>
+      </w:pPr>
+      <w:r>
+        <w:rPr>
+          <w:sz w:val="16"/>
+          <w:szCs w:val="16"/>
+        </w:rPr>
+        <w:t>Fig 1.2: Example of Kanban board</w:t>
+      </w:r>
+    </w:p>
+    <w:p>
+      <w:r>
+        <w:t xml:space="preserve">The Gantt Chart will be made in </w:t>
+      </w:r>
+      <w:r>
+        <w:t>Microsoft E</w:t>
+      </w:r>
+      <w:r>
+        <w:t>xcel</w:t>
+      </w:r>
+      <w:r>
+        <w:t xml:space="preserve"> </w:t>
+      </w:r>
+      <w:r>
+        <w:t>(</w:t>
+      </w:r>
+      <w:r>
+        <w:rPr>
+          <w:highlight w:val="yellow"/>
+        </w:rPr>
+        <w:t>INSERT REFERNCE</w:t>
+      </w:r>
+      <w:r>
+        <w:t>)</w:t>
+      </w:r>
+      <w:r>
+        <w:t xml:space="preserve">, and the Kanban Board will be </w:t>
+      </w:r>
+      <w:r>
+        <w:t>implemented in</w:t>
+      </w:r>
+      <w:r>
+        <w:t xml:space="preserve"> Trello</w:t>
+      </w:r>
+      <w:r>
+        <w:t xml:space="preserve"> (</w:t>
+      </w:r>
+      <w:r>
+        <w:rPr>
+          <w:highlight w:val="yellow"/>
+        </w:rPr>
+        <w:t>INSERT REFERNCE</w:t>
+      </w:r>
+      <w:r>
+        <w:t>)</w:t>
+      </w:r>
+      <w:r>
+        <w:t>.</w:t>
+      </w:r>
+    </w:p>
+    <w:p>
+      <w:pPr>
+        <w:rPr>
+          <w:rFonts w:ascii="Arial" w:hAnsi="Arial" w:cs="Arial"/>
+        </w:rPr>
+      </w:pPr>
     </w:p>
     <w:p>
       <w:pPr>
@@ -4123,6 +4448,7 @@
       </w:r>
       <w:bookmarkEnd w:id="28"/>
     </w:p>
+    <w:p/>
     <w:p/>
     <w:tbl>
       <w:tblPr>
@@ -4132,10 +4458,10 @@
         <w:tblLook w:val="04A0" w:firstRow="1" w:lastRow="0" w:firstColumn="1" w:lastColumn="0" w:noHBand="0" w:noVBand="1"/>
       </w:tblPr>
       <w:tblGrid>
-        <w:gridCol w:w="2043"/>
-        <w:gridCol w:w="1917"/>
-        <w:gridCol w:w="1846"/>
-        <w:gridCol w:w="2815"/>
+        <w:gridCol w:w="2067"/>
+        <w:gridCol w:w="1911"/>
+        <w:gridCol w:w="1842"/>
+        <w:gridCol w:w="2801"/>
       </w:tblGrid>
       <w:tr>
         <w:trPr>
@@ -4587,6 +4913,44 @@
                 <w:szCs w:val="20"/>
               </w:rPr>
               <w:t>Allocation of enough time to create the game.</w:t>
+            </w:r>
+          </w:p>
+          <w:p>
+            <w:pPr>
+              <w:spacing w:after="160" w:line="278" w:lineRule="auto"/>
+              <w:cnfStyle w:val="000000000000" w:firstRow="0" w:lastRow="0" w:firstColumn="0" w:lastColumn="0" w:oddVBand="0" w:evenVBand="0" w:oddHBand="0" w:evenHBand="0" w:firstRowFirstColumn="0" w:firstRowLastColumn="0" w:lastRowFirstColumn="0" w:lastRowLastColumn="0"/>
+              <w:rPr>
+                <w:rFonts w:ascii="Arial" w:hAnsi="Arial" w:cs="Arial"/>
+                <w:sz w:val="20"/>
+                <w:szCs w:val="20"/>
+              </w:rPr>
+            </w:pPr>
+            <w:r>
+              <w:rPr>
+                <w:rFonts w:ascii="Arial" w:hAnsi="Arial" w:cs="Arial"/>
+                <w:sz w:val="20"/>
+                <w:szCs w:val="20"/>
+              </w:rPr>
+              <w:t>Allocation of enough time to debug and internal testing.</w:t>
+            </w:r>
+          </w:p>
+          <w:p>
+            <w:pPr>
+              <w:spacing w:after="160" w:line="278" w:lineRule="auto"/>
+              <w:cnfStyle w:val="000000000000" w:firstRow="0" w:lastRow="0" w:firstColumn="0" w:lastColumn="0" w:oddVBand="0" w:evenVBand="0" w:oddHBand="0" w:evenHBand="0" w:firstRowFirstColumn="0" w:firstRowLastColumn="0" w:lastRowFirstColumn="0" w:lastRowLastColumn="0"/>
+              <w:rPr>
+                <w:rFonts w:ascii="Arial" w:hAnsi="Arial" w:cs="Arial"/>
+                <w:sz w:val="20"/>
+                <w:szCs w:val="20"/>
+              </w:rPr>
+            </w:pPr>
+            <w:r>
+              <w:rPr>
+                <w:rFonts w:ascii="Arial" w:hAnsi="Arial" w:cs="Arial"/>
+                <w:sz w:val="20"/>
+                <w:szCs w:val="20"/>
+              </w:rPr>
+              <w:t>Making sure that the game run smoothly through optimisation techniques</w:t>
             </w:r>
           </w:p>
           <w:p>
@@ -4712,7 +5076,34 @@
                 <w:sz w:val="20"/>
                 <w:szCs w:val="20"/>
               </w:rPr>
-              <w:t>e.g., Start recruitment early; use multiple recruitment channels; have a backup plan.</w:t>
+              <w:t xml:space="preserve">A GitHub repository will be used to ensure progression is not lost </w:t>
+            </w:r>
+            <w:r>
+              <w:rPr>
+                <w:rFonts w:ascii="Arial" w:hAnsi="Arial" w:cs="Arial"/>
+                <w:sz w:val="20"/>
+                <w:szCs w:val="20"/>
+              </w:rPr>
+              <w:t>through source control.</w:t>
+            </w:r>
+          </w:p>
+          <w:p>
+            <w:pPr>
+              <w:spacing w:after="160" w:line="278" w:lineRule="auto"/>
+              <w:cnfStyle w:val="000000100000" w:firstRow="0" w:lastRow="0" w:firstColumn="0" w:lastColumn="0" w:oddVBand="0" w:evenVBand="0" w:oddHBand="1" w:evenHBand="0" w:firstRowFirstColumn="0" w:firstRowLastColumn="0" w:lastRowFirstColumn="0" w:lastRowLastColumn="0"/>
+              <w:rPr>
+                <w:rFonts w:ascii="Arial" w:hAnsi="Arial" w:cs="Arial"/>
+                <w:sz w:val="20"/>
+                <w:szCs w:val="20"/>
+              </w:rPr>
+            </w:pPr>
+            <w:r>
+              <w:rPr>
+                <w:rFonts w:ascii="Arial" w:hAnsi="Arial" w:cs="Arial"/>
+                <w:sz w:val="20"/>
+                <w:szCs w:val="20"/>
+              </w:rPr>
+              <w:t>Frequent backup will be made to also remedy data loss.</w:t>
             </w:r>
           </w:p>
         </w:tc>
@@ -4741,31 +5132,119 @@
                 <w:sz w:val="20"/>
                 <w:szCs w:val="20"/>
               </w:rPr>
-              <w:t>Eye strain</w:t>
-            </w:r>
-            <w:r>
-              <w:rPr>
-                <w:rFonts w:ascii="Arial" w:hAnsi="Arial" w:cs="Arial"/>
-                <w:sz w:val="20"/>
-                <w:szCs w:val="20"/>
-              </w:rPr>
-              <w:t xml:space="preserve"> and fatigue</w:t>
-            </w:r>
-            <w:r>
-              <w:rPr>
-                <w:rFonts w:ascii="Arial" w:hAnsi="Arial" w:cs="Arial"/>
-                <w:sz w:val="20"/>
-                <w:szCs w:val="20"/>
-              </w:rPr>
-              <w:t xml:space="preserve"> due to prolonged </w:t>
-            </w:r>
-            <w:r>
-              <w:rPr>
-                <w:rFonts w:ascii="Arial" w:hAnsi="Arial" w:cs="Arial"/>
-                <w:sz w:val="20"/>
-                <w:szCs w:val="20"/>
-              </w:rPr>
-              <w:t>use of screens</w:t>
+              <w:t xml:space="preserve">Eye </w:t>
+            </w:r>
+            <w:r>
+              <w:rPr>
+                <w:rFonts w:ascii="Arial" w:hAnsi="Arial" w:cs="Arial"/>
+                <w:sz w:val="20"/>
+                <w:szCs w:val="20"/>
+              </w:rPr>
+              <w:t>S</w:t>
+            </w:r>
+            <w:r>
+              <w:rPr>
+                <w:rFonts w:ascii="Arial" w:hAnsi="Arial" w:cs="Arial"/>
+                <w:sz w:val="20"/>
+                <w:szCs w:val="20"/>
+              </w:rPr>
+              <w:t>train</w:t>
+            </w:r>
+            <w:r>
+              <w:rPr>
+                <w:rFonts w:ascii="Arial" w:hAnsi="Arial" w:cs="Arial"/>
+                <w:sz w:val="20"/>
+                <w:szCs w:val="20"/>
+              </w:rPr>
+              <w:t xml:space="preserve"> and </w:t>
+            </w:r>
+            <w:r>
+              <w:rPr>
+                <w:rFonts w:ascii="Arial" w:hAnsi="Arial" w:cs="Arial"/>
+                <w:sz w:val="20"/>
+                <w:szCs w:val="20"/>
+              </w:rPr>
+              <w:t>F</w:t>
+            </w:r>
+            <w:r>
+              <w:rPr>
+                <w:rFonts w:ascii="Arial" w:hAnsi="Arial" w:cs="Arial"/>
+                <w:sz w:val="20"/>
+                <w:szCs w:val="20"/>
+              </w:rPr>
+              <w:t>atigue</w:t>
+            </w:r>
+            <w:r>
+              <w:rPr>
+                <w:rFonts w:ascii="Arial" w:hAnsi="Arial" w:cs="Arial"/>
+                <w:sz w:val="20"/>
+                <w:szCs w:val="20"/>
+              </w:rPr>
+              <w:t xml:space="preserve"> </w:t>
+            </w:r>
+            <w:r>
+              <w:rPr>
+                <w:rFonts w:ascii="Arial" w:hAnsi="Arial" w:cs="Arial"/>
+                <w:sz w:val="20"/>
+                <w:szCs w:val="20"/>
+              </w:rPr>
+              <w:t>D</w:t>
+            </w:r>
+            <w:r>
+              <w:rPr>
+                <w:rFonts w:ascii="Arial" w:hAnsi="Arial" w:cs="Arial"/>
+                <w:sz w:val="20"/>
+                <w:szCs w:val="20"/>
+              </w:rPr>
+              <w:t xml:space="preserve">ue to </w:t>
+            </w:r>
+            <w:r>
+              <w:rPr>
+                <w:rFonts w:ascii="Arial" w:hAnsi="Arial" w:cs="Arial"/>
+                <w:sz w:val="20"/>
+                <w:szCs w:val="20"/>
+              </w:rPr>
+              <w:t>P</w:t>
+            </w:r>
+            <w:r>
+              <w:rPr>
+                <w:rFonts w:ascii="Arial" w:hAnsi="Arial" w:cs="Arial"/>
+                <w:sz w:val="20"/>
+                <w:szCs w:val="20"/>
+              </w:rPr>
+              <w:t xml:space="preserve">rolonged </w:t>
+            </w:r>
+            <w:r>
+              <w:rPr>
+                <w:rFonts w:ascii="Arial" w:hAnsi="Arial" w:cs="Arial"/>
+                <w:sz w:val="20"/>
+                <w:szCs w:val="20"/>
+              </w:rPr>
+              <w:t>U</w:t>
+            </w:r>
+            <w:r>
+              <w:rPr>
+                <w:rFonts w:ascii="Arial" w:hAnsi="Arial" w:cs="Arial"/>
+                <w:sz w:val="20"/>
+                <w:szCs w:val="20"/>
+              </w:rPr>
+              <w:t xml:space="preserve">se of </w:t>
+            </w:r>
+            <w:r>
+              <w:rPr>
+                <w:rFonts w:ascii="Arial" w:hAnsi="Arial" w:cs="Arial"/>
+                <w:sz w:val="20"/>
+                <w:szCs w:val="20"/>
+              </w:rPr>
+              <w:t>S</w:t>
+            </w:r>
+            <w:r>
+              <w:rPr>
+                <w:rFonts w:ascii="Arial" w:hAnsi="Arial" w:cs="Arial"/>
+                <w:sz w:val="20"/>
+                <w:szCs w:val="20"/>
+              </w:rPr>
+              <w:t>creens</w:t>
             </w:r>
           </w:p>
         </w:tc>
@@ -4900,6 +5379,30 @@
                 <w:szCs w:val="20"/>
               </w:rPr>
             </w:pPr>
+            <w:r>
+              <w:rPr>
+                <w:rFonts w:ascii="Arial" w:hAnsi="Arial" w:cs="Arial"/>
+                <w:sz w:val="20"/>
+                <w:szCs w:val="20"/>
+              </w:rPr>
+              <w:t xml:space="preserve">Low </w:t>
+            </w:r>
+            <w:r>
+              <w:rPr>
+                <w:rFonts w:ascii="Arial" w:hAnsi="Arial" w:cs="Arial"/>
+                <w:sz w:val="20"/>
+                <w:szCs w:val="20"/>
+              </w:rPr>
+              <w:t>P</w:t>
+            </w:r>
+            <w:r>
+              <w:rPr>
+                <w:rFonts w:ascii="Arial" w:hAnsi="Arial" w:cs="Arial"/>
+                <w:sz w:val="20"/>
+                <w:szCs w:val="20"/>
+              </w:rPr>
+              <w:t>articipants</w:t>
+            </w:r>
           </w:p>
         </w:tc>
         <w:tc>
@@ -4915,6 +5418,14 @@
                 <w:szCs w:val="20"/>
               </w:rPr>
             </w:pPr>
+            <w:r>
+              <w:rPr>
+                <w:rFonts w:ascii="Arial" w:hAnsi="Arial" w:cs="Arial"/>
+                <w:sz w:val="20"/>
+                <w:szCs w:val="20"/>
+              </w:rPr>
+              <w:t>Medium</w:t>
+            </w:r>
           </w:p>
         </w:tc>
         <w:tc>
@@ -4930,6 +5441,14 @@
                 <w:szCs w:val="20"/>
               </w:rPr>
             </w:pPr>
+            <w:r>
+              <w:rPr>
+                <w:rFonts w:ascii="Arial" w:hAnsi="Arial" w:cs="Arial"/>
+                <w:sz w:val="20"/>
+                <w:szCs w:val="20"/>
+              </w:rPr>
+              <w:t>High</w:t>
+            </w:r>
           </w:p>
         </w:tc>
         <w:tc>
@@ -4945,6 +5464,182 @@
                 <w:szCs w:val="20"/>
               </w:rPr>
             </w:pPr>
+            <w:r>
+              <w:rPr>
+                <w:rFonts w:ascii="Arial" w:hAnsi="Arial" w:cs="Arial"/>
+                <w:sz w:val="20"/>
+                <w:szCs w:val="20"/>
+              </w:rPr>
+              <w:t>Start recruiting early to prevent lack of participants</w:t>
+            </w:r>
+            <w:r>
+              <w:rPr>
+                <w:rFonts w:ascii="Arial" w:hAnsi="Arial" w:cs="Arial"/>
+                <w:sz w:val="20"/>
+                <w:szCs w:val="20"/>
+              </w:rPr>
+              <w:t>.</w:t>
+            </w:r>
+          </w:p>
+          <w:p>
+            <w:pPr>
+              <w:cnfStyle w:val="000000100000" w:firstRow="0" w:lastRow="0" w:firstColumn="0" w:lastColumn="0" w:oddVBand="0" w:evenVBand="0" w:oddHBand="1" w:evenHBand="0" w:firstRowFirstColumn="0" w:firstRowLastColumn="0" w:lastRowFirstColumn="0" w:lastRowLastColumn="0"/>
+              <w:rPr>
+                <w:rFonts w:ascii="Arial" w:hAnsi="Arial" w:cs="Arial"/>
+                <w:sz w:val="20"/>
+                <w:szCs w:val="20"/>
+              </w:rPr>
+            </w:pPr>
+          </w:p>
+        </w:tc>
+      </w:tr>
+      <w:tr>
+        <w:trPr>
+          <w:trHeight w:val="567"/>
+          <w:jc w:val="center"/>
+        </w:trPr>
+        <w:tc>
+          <w:tcPr>
+            <w:cnfStyle w:val="001000000000" w:firstRow="0" w:lastRow="0" w:firstColumn="1" w:lastColumn="0" w:oddVBand="0" w:evenVBand="0" w:oddHBand="0" w:evenHBand="0" w:firstRowFirstColumn="0" w:firstRowLastColumn="0" w:lastRowFirstColumn="0" w:lastRowLastColumn="0"/>
+            <w:tcW w:w="0" w:type="auto"/>
+          </w:tcPr>
+          <w:p>
+            <w:pPr>
+              <w:rPr>
+                <w:rFonts w:ascii="Arial" w:hAnsi="Arial" w:cs="Arial"/>
+                <w:sz w:val="20"/>
+                <w:szCs w:val="20"/>
+              </w:rPr>
+            </w:pPr>
+            <w:r>
+              <w:rPr>
+                <w:rFonts w:ascii="Arial" w:hAnsi="Arial" w:cs="Arial"/>
+                <w:sz w:val="20"/>
+                <w:szCs w:val="20"/>
+              </w:rPr>
+              <w:t>Ambiguous Survey</w:t>
+            </w:r>
+            <w:r>
+              <w:rPr>
+                <w:rFonts w:ascii="Arial" w:hAnsi="Arial" w:cs="Arial"/>
+                <w:sz w:val="20"/>
+                <w:szCs w:val="20"/>
+              </w:rPr>
+              <w:t xml:space="preserve"> </w:t>
+            </w:r>
+          </w:p>
+        </w:tc>
+        <w:tc>
+          <w:tcPr>
+            <w:tcW w:w="0" w:type="auto"/>
+          </w:tcPr>
+          <w:p>
+            <w:pPr>
+              <w:cnfStyle w:val="000000000000" w:firstRow="0" w:lastRow="0" w:firstColumn="0" w:lastColumn="0" w:oddVBand="0" w:evenVBand="0" w:oddHBand="0" w:evenHBand="0" w:firstRowFirstColumn="0" w:firstRowLastColumn="0" w:lastRowFirstColumn="0" w:lastRowLastColumn="0"/>
+              <w:rPr>
+                <w:rFonts w:ascii="Arial" w:hAnsi="Arial" w:cs="Arial"/>
+                <w:sz w:val="20"/>
+                <w:szCs w:val="20"/>
+              </w:rPr>
+            </w:pPr>
+            <w:r>
+              <w:rPr>
+                <w:rFonts w:ascii="Arial" w:hAnsi="Arial" w:cs="Arial"/>
+                <w:sz w:val="20"/>
+                <w:szCs w:val="20"/>
+              </w:rPr>
+              <w:t>Low</w:t>
+            </w:r>
+          </w:p>
+        </w:tc>
+        <w:tc>
+          <w:tcPr>
+            <w:tcW w:w="0" w:type="auto"/>
+          </w:tcPr>
+          <w:p>
+            <w:pPr>
+              <w:cnfStyle w:val="000000000000" w:firstRow="0" w:lastRow="0" w:firstColumn="0" w:lastColumn="0" w:oddVBand="0" w:evenVBand="0" w:oddHBand="0" w:evenHBand="0" w:firstRowFirstColumn="0" w:firstRowLastColumn="0" w:lastRowFirstColumn="0" w:lastRowLastColumn="0"/>
+              <w:rPr>
+                <w:rFonts w:ascii="Arial" w:hAnsi="Arial" w:cs="Arial"/>
+                <w:sz w:val="20"/>
+                <w:szCs w:val="20"/>
+              </w:rPr>
+            </w:pPr>
+            <w:r>
+              <w:rPr>
+                <w:rFonts w:ascii="Arial" w:hAnsi="Arial" w:cs="Arial"/>
+                <w:sz w:val="20"/>
+                <w:szCs w:val="20"/>
+              </w:rPr>
+              <w:t>High</w:t>
+            </w:r>
+          </w:p>
+        </w:tc>
+        <w:tc>
+          <w:tcPr>
+            <w:tcW w:w="0" w:type="auto"/>
+          </w:tcPr>
+          <w:p>
+            <w:pPr>
+              <w:cnfStyle w:val="000000000000" w:firstRow="0" w:lastRow="0" w:firstColumn="0" w:lastColumn="0" w:oddVBand="0" w:evenVBand="0" w:oddHBand="0" w:evenHBand="0" w:firstRowFirstColumn="0" w:firstRowLastColumn="0" w:lastRowFirstColumn="0" w:lastRowLastColumn="0"/>
+              <w:rPr>
+                <w:rFonts w:ascii="Arial" w:hAnsi="Arial" w:cs="Arial"/>
+                <w:sz w:val="20"/>
+                <w:szCs w:val="20"/>
+              </w:rPr>
+            </w:pPr>
+            <w:r>
+              <w:rPr>
+                <w:rFonts w:ascii="Arial" w:hAnsi="Arial" w:cs="Arial"/>
+                <w:sz w:val="20"/>
+                <w:szCs w:val="20"/>
+              </w:rPr>
+              <w:t>Review the survey to ensure that the variables being measured are adequate.</w:t>
+            </w:r>
+          </w:p>
+          <w:p>
+            <w:pPr>
+              <w:cnfStyle w:val="000000000000" w:firstRow="0" w:lastRow="0" w:firstColumn="0" w:lastColumn="0" w:oddVBand="0" w:evenVBand="0" w:oddHBand="0" w:evenHBand="0" w:firstRowFirstColumn="0" w:firstRowLastColumn="0" w:lastRowFirstColumn="0" w:lastRowLastColumn="0"/>
+              <w:rPr>
+                <w:rFonts w:ascii="Arial" w:hAnsi="Arial" w:cs="Arial"/>
+                <w:sz w:val="20"/>
+                <w:szCs w:val="20"/>
+              </w:rPr>
+            </w:pPr>
+            <w:r>
+              <w:rPr>
+                <w:rFonts w:ascii="Arial" w:hAnsi="Arial" w:cs="Arial"/>
+                <w:sz w:val="20"/>
+                <w:szCs w:val="20"/>
+              </w:rPr>
+              <w:t>Use automatic backups within Microsoft Forms.</w:t>
+            </w:r>
+          </w:p>
+          <w:p>
+            <w:pPr>
+              <w:cnfStyle w:val="000000000000" w:firstRow="0" w:lastRow="0" w:firstColumn="0" w:lastColumn="0" w:oddVBand="0" w:evenVBand="0" w:oddHBand="0" w:evenHBand="0" w:firstRowFirstColumn="0" w:firstRowLastColumn="0" w:lastRowFirstColumn="0" w:lastRowLastColumn="0"/>
+              <w:rPr>
+                <w:rFonts w:ascii="Arial" w:hAnsi="Arial" w:cs="Arial"/>
+                <w:sz w:val="20"/>
+                <w:szCs w:val="20"/>
+              </w:rPr>
+            </w:pPr>
+            <w:r>
+              <w:rPr>
+                <w:rFonts w:ascii="Arial" w:hAnsi="Arial" w:cs="Arial"/>
+                <w:sz w:val="20"/>
+                <w:szCs w:val="20"/>
+              </w:rPr>
+              <w:t>If findings are unexpected, review</w:t>
+            </w:r>
+            <w:r>
+              <w:rPr>
+                <w:rFonts w:ascii="Arial" w:hAnsi="Arial" w:cs="Arial"/>
+                <w:sz w:val="20"/>
+                <w:szCs w:val="20"/>
+              </w:rPr>
+              <w:t xml:space="preserve"> and interpret them.</w:t>
+            </w:r>
           </w:p>
         </w:tc>
       </w:tr>
@@ -4990,79 +5685,37 @@
         <w:rPr>
           <w:rFonts w:ascii="Arial" w:hAnsi="Arial" w:cs="Arial"/>
         </w:rPr>
-        <w:t>Ethical</w:t>
-      </w:r>
-    </w:p>
-    <w:p>
-      <w:pPr>
-        <w:pStyle w:val="ListParagraph"/>
-        <w:numPr>
-          <w:ilvl w:val="0"/>
-          <w:numId w:val="3"/>
-        </w:numPr>
-        <w:rPr>
-          <w:rFonts w:ascii="Arial" w:hAnsi="Arial" w:cs="Arial"/>
-        </w:rPr>
-      </w:pPr>
-      <w:r>
-        <w:rPr>
-          <w:rFonts w:ascii="Arial" w:hAnsi="Arial" w:cs="Arial"/>
-        </w:rPr>
-        <w:t>Informed consent</w:t>
-      </w:r>
-    </w:p>
-    <w:p>
-      <w:pPr>
-        <w:pStyle w:val="ListParagraph"/>
-        <w:numPr>
-          <w:ilvl w:val="0"/>
-          <w:numId w:val="3"/>
-        </w:numPr>
-        <w:rPr>
-          <w:rFonts w:ascii="Arial" w:hAnsi="Arial" w:cs="Arial"/>
-        </w:rPr>
-      </w:pPr>
-      <w:r>
-        <w:rPr>
-          <w:rFonts w:ascii="Arial" w:hAnsi="Arial" w:cs="Arial"/>
-        </w:rPr>
-        <w:t>Anonymity</w:t>
-      </w:r>
-    </w:p>
-    <w:p>
-      <w:pPr>
-        <w:pStyle w:val="ListParagraph"/>
-        <w:numPr>
-          <w:ilvl w:val="0"/>
-          <w:numId w:val="3"/>
-        </w:numPr>
-        <w:rPr>
-          <w:rFonts w:ascii="Arial" w:hAnsi="Arial" w:cs="Arial"/>
-        </w:rPr>
-      </w:pPr>
-      <w:r>
-        <w:rPr>
-          <w:rFonts w:ascii="Arial" w:hAnsi="Arial" w:cs="Arial"/>
-        </w:rPr>
-        <w:t>Confidentiality</w:t>
-      </w:r>
-    </w:p>
-    <w:p>
-      <w:pPr>
-        <w:pStyle w:val="ListParagraph"/>
-        <w:numPr>
-          <w:ilvl w:val="1"/>
-          <w:numId w:val="3"/>
-        </w:numPr>
-        <w:rPr>
-          <w:rFonts w:ascii="Arial" w:hAnsi="Arial" w:cs="Arial"/>
-        </w:rPr>
-      </w:pPr>
-      <w:r>
-        <w:rPr>
-          <w:rFonts w:ascii="Arial" w:hAnsi="Arial" w:cs="Arial"/>
-        </w:rPr>
-        <w:t>Use Microsoft forms as university is required to GDPR</w:t>
+        <w:t xml:space="preserve">Ethical considerations have been considered throughout the project. </w:t>
+      </w:r>
+      <w:r>
+        <w:rPr>
+          <w:rFonts w:ascii="Arial" w:hAnsi="Arial" w:cs="Arial"/>
+        </w:rPr>
+        <w:t xml:space="preserve">All participants will be required to sign a digital consent form before testing. The participants will also be able to </w:t>
+      </w:r>
+      <w:r>
+        <w:rPr>
+          <w:rFonts w:ascii="Arial" w:hAnsi="Arial" w:cs="Arial"/>
+        </w:rPr>
+        <w:t xml:space="preserve">withdraw consent anytime during the testing procedure. All surveys made will be hosted through Microsoft Forms, ensuring that </w:t>
+      </w:r>
+      <w:r>
+        <w:rPr>
+          <w:rFonts w:ascii="Arial" w:hAnsi="Arial" w:cs="Arial"/>
+        </w:rPr>
+        <w:t>GDPR compliance and data protection will be present throughout.</w:t>
+      </w:r>
+      <w:r>
+        <w:rPr>
+          <w:rFonts w:ascii="Arial" w:hAnsi="Arial" w:cs="Arial"/>
+        </w:rPr>
+        <w:t xml:space="preserve"> In addition, no personal data will be collected to ensure that the participant is truly anonymous.</w:t>
+      </w:r>
+      <w:r>
+        <w:rPr>
+          <w:rFonts w:ascii="Arial" w:hAnsi="Arial" w:cs="Arial"/>
+        </w:rPr>
+        <w:t xml:space="preserve"> Data that is stored will be stored through the university.</w:t>
       </w:r>
     </w:p>
     <w:p>
@@ -5093,9 +5746,17 @@
           <w:szCs w:val="22"/>
         </w:rPr>
       </w:pPr>
+      <w:r>
+        <w:rPr>
+          <w:rFonts w:ascii="Arial" w:hAnsi="Arial" w:cs="Arial"/>
+          <w:sz w:val="22"/>
+          <w:szCs w:val="22"/>
+        </w:rPr>
+        <w:t>Include any additional material here, such as review steps, specifications, and methodologies.</w:t>
+      </w:r>
     </w:p>
     <w:sectPr>
-      <w:headerReference w:type="default" r:id="rId11"/>
+      <w:headerReference w:type="default" r:id="rId13"/>
       <w:type w:val="continuous"/>
       <w:pgSz w:w="11910" w:h="16840"/>
       <w:pgMar w:top="2365" w:right="1361" w:bottom="1361" w:left="1361" w:header="992" w:footer="987" w:gutter="567"/>
@@ -6235,6 +6896,7 @@
   <w:style w:type="character" w:default="1" w:styleId="DefaultParagraphFont">
     <w:name w:val="Default Paragraph Font"/>
     <w:uiPriority w:val="1"/>
+    <w:semiHidden/>
     <w:unhideWhenUsed/>
   </w:style>
   <w:style w:type="table" w:default="1" w:styleId="TableNormal">
@@ -7171,14 +7833,6 @@
 </file>
 
 <file path=customXml/item1.xml><?xml version="1.0" encoding="utf-8"?>
-<p:properties xmlns:p="http://schemas.microsoft.com/office/2006/metadata/properties" xmlns:xsi="http://www.w3.org/2001/XMLSchema-instance" xmlns:pc="http://schemas.microsoft.com/office/infopath/2007/PartnerControls">
-  <documentManagement>
-    <_activity xmlns="4e6bee01-fae3-4e1c-8f1a-9ed0fe9197f3" xsi:nil="true"/>
-  </documentManagement>
-</p:properties>
-</file>
-
-<file path=customXml/item2.xml><?xml version="1.0" encoding="utf-8"?>
 <ct:contentTypeSchema xmlns:ct="http://schemas.microsoft.com/office/2006/metadata/contentType" xmlns:ma="http://schemas.microsoft.com/office/2006/metadata/properties/metaAttributes" ct:_="" ma:_="" ma:contentTypeName="Document" ma:contentTypeID="0x0101008F0F6E24CBBDF2489BB0C7D787BF1FA9" ma:contentTypeVersion="15" ma:contentTypeDescription="Create a new document." ma:contentTypeScope="" ma:versionID="2d4b1107e0bcd24d879f2e81b4ffe2f7">
   <xsd:schema xmlns:xsd="http://www.w3.org/2001/XMLSchema" xmlns:xs="http://www.w3.org/2001/XMLSchema" xmlns:p="http://schemas.microsoft.com/office/2006/metadata/properties" xmlns:ns3="4e6bee01-fae3-4e1c-8f1a-9ed0fe9197f3" xmlns:ns4="9ebee74b-6c09-439e-a20a-fc6d1b49bd2d" targetNamespace="http://schemas.microsoft.com/office/2006/metadata/properties" ma:root="true" ma:fieldsID="5cc5db8e17a87248a928f297a097d818" ns3:_="" ns4:_="">
     <xsd:import namespace="4e6bee01-fae3-4e1c-8f1a-9ed0fe9197f3"/>
@@ -7411,7 +8065,7 @@
 </ct:contentTypeSchema>
 </file>
 
-<file path=customXml/item3.xml><?xml version="1.0" encoding="utf-8"?>
+<file path=customXml/item2.xml><?xml version="1.0" encoding="utf-8"?>
 <?mso-contentType ?>
 <FormTemplates xmlns="http://schemas.microsoft.com/sharepoint/v3/contenttype/forms">
   <Display>DocumentLibraryForm</Display>
@@ -7420,21 +8074,19 @@
 </FormTemplates>
 </file>
 
-<file path=customXml/item4.xml><?xml version="1.0" encoding="utf-8"?>
+<file path=customXml/item3.xml><?xml version="1.0" encoding="utf-8"?>
 <b:Sources xmlns:b="http://schemas.openxmlformats.org/officeDocument/2006/bibliography" xmlns="http://schemas.openxmlformats.org/officeDocument/2006/bibliography" SelectedStyle="\APASixthEditionOfficeOnline.xsl" StyleName="APA" Version="6"/>
 </file>
 
-<file path=customXml/itemProps1.xml><?xml version="1.0" encoding="utf-8"?>
-<ds:datastoreItem xmlns:ds="http://schemas.openxmlformats.org/officeDocument/2006/customXml" ds:itemID="{427E592C-BA00-4E9F-856E-27CA4AE42C28}">
-  <ds:schemaRefs>
-    <ds:schemaRef ds:uri="http://schemas.microsoft.com/office/2006/metadata/properties"/>
-    <ds:schemaRef ds:uri="http://schemas.microsoft.com/office/infopath/2007/PartnerControls"/>
-    <ds:schemaRef ds:uri="4e6bee01-fae3-4e1c-8f1a-9ed0fe9197f3"/>
-  </ds:schemaRefs>
-</ds:datastoreItem>
+<file path=customXml/item4.xml><?xml version="1.0" encoding="utf-8"?>
+<p:properties xmlns:p="http://schemas.microsoft.com/office/2006/metadata/properties" xmlns:xsi="http://www.w3.org/2001/XMLSchema-instance" xmlns:pc="http://schemas.microsoft.com/office/infopath/2007/PartnerControls">
+  <documentManagement>
+    <_activity xmlns="4e6bee01-fae3-4e1c-8f1a-9ed0fe9197f3" xsi:nil="true"/>
+  </documentManagement>
+</p:properties>
 </file>
 
-<file path=customXml/itemProps2.xml><?xml version="1.0" encoding="utf-8"?>
+<file path=customXml/itemProps1.xml><?xml version="1.0" encoding="utf-8"?>
 <ds:datastoreItem xmlns:ds="http://schemas.openxmlformats.org/officeDocument/2006/customXml" ds:itemID="{71FFA508-172B-43AC-84A2-26545FBF7306}">
   <ds:schemaRefs>
     <ds:schemaRef ds:uri="http://schemas.microsoft.com/office/2006/metadata/contentType"/>
@@ -7453,7 +8105,7 @@
 </ds:datastoreItem>
 </file>
 
-<file path=customXml/itemProps3.xml><?xml version="1.0" encoding="utf-8"?>
+<file path=customXml/itemProps2.xml><?xml version="1.0" encoding="utf-8"?>
 <ds:datastoreItem xmlns:ds="http://schemas.openxmlformats.org/officeDocument/2006/customXml" ds:itemID="{E4A5EDD7-4E6F-4D6E-A621-24883E4CA807}">
   <ds:schemaRefs>
     <ds:schemaRef ds:uri="http://schemas.microsoft.com/sharepoint/v3/contenttype/forms"/>
@@ -7461,10 +8113,20 @@
 </ds:datastoreItem>
 </file>
 
-<file path=customXml/itemProps4.xml><?xml version="1.0" encoding="utf-8"?>
+<file path=customXml/itemProps3.xml><?xml version="1.0" encoding="utf-8"?>
 <ds:datastoreItem xmlns:ds="http://schemas.openxmlformats.org/officeDocument/2006/customXml" ds:itemID="{01737935-5D60-4040-8892-9E4074313170}">
   <ds:schemaRefs>
     <ds:schemaRef ds:uri="http://schemas.openxmlformats.org/officeDocument/2006/bibliography"/>
   </ds:schemaRefs>
 </ds:datastoreItem>
+</file>
+
+<file path=customXml/itemProps4.xml><?xml version="1.0" encoding="utf-8"?>
+<ds:datastoreItem xmlns:ds="http://schemas.openxmlformats.org/officeDocument/2006/customXml" ds:itemID="{427E592C-BA00-4E9F-856E-27CA4AE42C28}">
+  <ds:schemaRefs>
+    <ds:schemaRef ds:uri="http://schemas.microsoft.com/office/2006/metadata/properties"/>
+    <ds:schemaRef ds:uri="http://schemas.microsoft.com/office/infopath/2007/PartnerControls"/>
+    <ds:schemaRef ds:uri="4e6bee01-fae3-4e1c-8f1a-9ed0fe9197f3"/>
+  </ds:schemaRefs>
+</ds:datastoreItem>
 </file>
</xml_diff>

<commit_message>
2.7k words, starting gap analysis
</commit_message>
<xml_diff>
--- a/[Vennce Bravo - 231402264] 25-26 Project Interim Report Template .docx
+++ b/[Vennce Bravo - 231402264] 25-26 Project Interim Report Template .docx
@@ -125,7 +125,7 @@
           </mc:Choice>
           <mc:Fallback>
             <w:pict>
-              <v:line w14:anchorId="32117DA1" id="Straight Connector 12" o:spid="_x0000_s1026" style="position:absolute;z-index:251658240;visibility:visible;mso-wrap-style:square;mso-width-percent:0;mso-height-percent:0;mso-wrap-distance-left:9pt;mso-wrap-distance-top:0;mso-wrap-distance-right:9pt;mso-wrap-distance-bottom:0;mso-position-horizontal:absolute;mso-position-horizontal-relative:margin;mso-position-vertical:absolute;mso-position-vertical-relative:text;mso-width-percent:0;mso-height-percent:0;mso-width-relative:margin;mso-height-relative:margin" from="3.2pt,9.85pt" to="456.7pt,9.85pt" o:gfxdata="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" strokecolor="#0e2841 [3215]" strokeweight="2.25pt">
+              <v:line w14:anchorId="15AF6D02" id="Straight Connector 12" o:spid="_x0000_s1026" style="position:absolute;z-index:251658240;visibility:visible;mso-wrap-style:square;mso-width-percent:0;mso-height-percent:0;mso-wrap-distance-left:9pt;mso-wrap-distance-top:0;mso-wrap-distance-right:9pt;mso-wrap-distance-bottom:0;mso-position-horizontal:absolute;mso-position-horizontal-relative:margin;mso-position-vertical:absolute;mso-position-vertical-relative:text;mso-width-percent:0;mso-height-percent:0;mso-width-relative:margin;mso-height-relative:margin" from="3.2pt,9.85pt" to="456.7pt,9.85pt" o:gfxdata="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" strokecolor="#0e2841 [3215]" strokeweight="2.25pt">
                 <v:stroke dashstyle="dash" opacity="50372f" linestyle="thinThin" endcap="round"/>
                 <v:shadow on="t" color="black" opacity="26214f" origin=",-.5" offset="0,3pt"/>
                 <w10:wrap anchorx="margin"/>
@@ -405,7 +405,7 @@
           </mc:Choice>
           <mc:Fallback>
             <w:pict>
-              <v:line w14:anchorId="322A27F1" id="Straight Connector 12" o:spid="_x0000_s1026" style="position:absolute;z-index:251658241;visibility:visible;mso-wrap-style:square;mso-width-percent:0;mso-height-percent:0;mso-wrap-distance-left:9pt;mso-wrap-distance-top:0;mso-wrap-distance-right:9pt;mso-wrap-distance-bottom:0;mso-position-horizontal:absolute;mso-position-horizontal-relative:margin;mso-position-vertical:absolute;mso-position-vertical-relative:text;mso-width-percent:0;mso-height-percent:0;mso-width-relative:margin;mso-height-relative:margin" from="3.8pt,24.3pt" to="457.3pt,24.3pt" o:gfxdata="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" strokecolor="#0e2841 [3215]" strokeweight="2.25pt">
+              <v:line w14:anchorId="53FE8B8E" id="Straight Connector 12" o:spid="_x0000_s1026" style="position:absolute;z-index:251658241;visibility:visible;mso-wrap-style:square;mso-width-percent:0;mso-height-percent:0;mso-wrap-distance-left:9pt;mso-wrap-distance-top:0;mso-wrap-distance-right:9pt;mso-wrap-distance-bottom:0;mso-position-horizontal:absolute;mso-position-horizontal-relative:margin;mso-position-vertical:absolute;mso-position-vertical-relative:text;mso-width-percent:0;mso-height-percent:0;mso-width-relative:margin;mso-height-relative:margin" from="3.8pt,24.3pt" to="457.3pt,24.3pt" o:gfxdata="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" strokecolor="#0e2841 [3215]" strokeweight="2.25pt">
                 <v:stroke dashstyle="dash" opacity="50372f" linestyle="thinThin" endcap="round"/>
                 <v:shadow on="t" color="black" opacity="26214f" origin=",-.5" offset="0,3pt"/>
                 <w10:wrap anchorx="margin"/>
@@ -2687,9 +2687,7 @@
           <w:szCs w:val="22"/>
         </w:rPr>
       </w:pPr>
-    </w:p>
-    <w:p>
-      <w:pPr>
+      <w:r>
         <w:rPr>
           <w:rFonts w:ascii="Arial" w:hAnsi="Arial" w:cs="Arial"/>
           <w:b/>
@@ -2697,6 +2695,18 @@
           <w:sz w:val="22"/>
           <w:szCs w:val="22"/>
         </w:rPr>
+        <w:t>List of Figures</w:t>
+      </w:r>
+    </w:p>
+    <w:p>
+      <w:pPr>
+        <w:pStyle w:val="TableofFigures"/>
+        <w:tabs>
+          <w:tab w:val="right" w:leader="dot" w:pos="8611"/>
+        </w:tabs>
+        <w:rPr>
+          <w:noProof/>
+        </w:rPr>
       </w:pPr>
       <w:r>
         <w:rPr>
@@ -2706,11 +2716,9 @@
           <w:sz w:val="22"/>
           <w:szCs w:val="22"/>
         </w:rPr>
-        <w:t>List of Figures</w:t>
-      </w:r>
-    </w:p>
-    <w:p>
-      <w:pPr>
+        <w:fldChar w:fldCharType="begin"/>
+      </w:r>
+      <w:r>
         <w:rPr>
           <w:rFonts w:ascii="Arial" w:hAnsi="Arial" w:cs="Arial"/>
           <w:b/>
@@ -2718,10 +2726,9 @@
           <w:sz w:val="22"/>
           <w:szCs w:val="22"/>
         </w:rPr>
-      </w:pPr>
-    </w:p>
-    <w:p>
-      <w:pPr>
+        <w:instrText xml:space="preserve"> TOC \h \z \c "Figure" </w:instrText>
+      </w:r>
+      <w:r>
         <w:rPr>
           <w:rFonts w:ascii="Arial" w:hAnsi="Arial" w:cs="Arial"/>
           <w:b/>
@@ -2729,8 +2736,136 @@
           <w:sz w:val="22"/>
           <w:szCs w:val="22"/>
         </w:rPr>
-      </w:pPr>
-      <w:r>
+        <w:fldChar w:fldCharType="separate"/>
+      </w:r>
+      <w:hyperlink w:anchor="_Toc212731684" w:history="1">
+        <w:r>
+          <w:rPr>
+            <w:rStyle w:val="Hyperlink"/>
+            <w:noProof/>
+          </w:rPr>
+          <w:t>Figure 1: Example of Gantt Chart</w:t>
+        </w:r>
+        <w:r>
+          <w:rPr>
+            <w:noProof/>
+            <w:webHidden/>
+          </w:rPr>
+          <w:tab/>
+        </w:r>
+        <w:r>
+          <w:rPr>
+            <w:noProof/>
+            <w:webHidden/>
+          </w:rPr>
+          <w:fldChar w:fldCharType="begin"/>
+        </w:r>
+        <w:r>
+          <w:rPr>
+            <w:noProof/>
+            <w:webHidden/>
+          </w:rPr>
+          <w:instrText xml:space="preserve"> PAGEREF _Toc212731684 \h </w:instrText>
+        </w:r>
+        <w:r>
+          <w:rPr>
+            <w:noProof/>
+            <w:webHidden/>
+          </w:rPr>
+        </w:r>
+        <w:r>
+          <w:rPr>
+            <w:noProof/>
+            <w:webHidden/>
+          </w:rPr>
+          <w:fldChar w:fldCharType="separate"/>
+        </w:r>
+        <w:r>
+          <w:rPr>
+            <w:noProof/>
+            <w:webHidden/>
+          </w:rPr>
+          <w:t>1</w:t>
+        </w:r>
+        <w:r>
+          <w:rPr>
+            <w:noProof/>
+            <w:webHidden/>
+          </w:rPr>
+          <w:fldChar w:fldCharType="end"/>
+        </w:r>
+      </w:hyperlink>
+    </w:p>
+    <w:p>
+      <w:pPr>
+        <w:pStyle w:val="TableofFigures"/>
+        <w:tabs>
+          <w:tab w:val="right" w:leader="dot" w:pos="8611"/>
+        </w:tabs>
+        <w:rPr>
+          <w:noProof/>
+        </w:rPr>
+      </w:pPr>
+      <w:hyperlink w:anchor="_Toc212731685" w:history="1">
+        <w:r>
+          <w:rPr>
+            <w:rStyle w:val="Hyperlink"/>
+            <w:noProof/>
+          </w:rPr>
+          <w:t>Figure 2: Example of Kanban Board</w:t>
+        </w:r>
+        <w:r>
+          <w:rPr>
+            <w:noProof/>
+            <w:webHidden/>
+          </w:rPr>
+          <w:tab/>
+        </w:r>
+        <w:r>
+          <w:rPr>
+            <w:noProof/>
+            <w:webHidden/>
+          </w:rPr>
+          <w:fldChar w:fldCharType="begin"/>
+        </w:r>
+        <w:r>
+          <w:rPr>
+            <w:noProof/>
+            <w:webHidden/>
+          </w:rPr>
+          <w:instrText xml:space="preserve"> PAGEREF _Toc212731685 \h </w:instrText>
+        </w:r>
+        <w:r>
+          <w:rPr>
+            <w:noProof/>
+            <w:webHidden/>
+          </w:rPr>
+        </w:r>
+        <w:r>
+          <w:rPr>
+            <w:noProof/>
+            <w:webHidden/>
+          </w:rPr>
+          <w:fldChar w:fldCharType="separate"/>
+        </w:r>
+        <w:r>
+          <w:rPr>
+            <w:noProof/>
+            <w:webHidden/>
+          </w:rPr>
+          <w:t>1</w:t>
+        </w:r>
+        <w:r>
+          <w:rPr>
+            <w:noProof/>
+            <w:webHidden/>
+          </w:rPr>
+          <w:fldChar w:fldCharType="end"/>
+        </w:r>
+      </w:hyperlink>
+    </w:p>
+    <w:p>
+      <w:pPr>
         <w:rPr>
           <w:rFonts w:ascii="Arial" w:hAnsi="Arial" w:cs="Arial"/>
           <w:b/>
@@ -2738,11 +2873,162 @@
           <w:sz w:val="22"/>
           <w:szCs w:val="22"/>
         </w:rPr>
+      </w:pPr>
+      <w:r>
+        <w:rPr>
+          <w:rFonts w:ascii="Arial" w:hAnsi="Arial" w:cs="Arial"/>
+          <w:b/>
+          <w:bCs/>
+          <w:sz w:val="22"/>
+          <w:szCs w:val="22"/>
+        </w:rPr>
+        <w:fldChar w:fldCharType="end"/>
+      </w:r>
+    </w:p>
+    <w:p>
+      <w:pPr>
+        <w:rPr>
+          <w:rFonts w:ascii="Arial" w:hAnsi="Arial" w:cs="Arial"/>
+          <w:b/>
+          <w:bCs/>
+          <w:sz w:val="22"/>
+          <w:szCs w:val="22"/>
+        </w:rPr>
+      </w:pPr>
+      <w:r>
+        <w:rPr>
+          <w:rFonts w:ascii="Arial" w:hAnsi="Arial" w:cs="Arial"/>
+          <w:b/>
+          <w:bCs/>
+          <w:sz w:val="22"/>
+          <w:szCs w:val="22"/>
+        </w:rPr>
         <w:t>List of Tables</w:t>
       </w:r>
     </w:p>
     <w:p>
       <w:pPr>
+        <w:pStyle w:val="TableofFigures"/>
+        <w:tabs>
+          <w:tab w:val="right" w:leader="dot" w:pos="8611"/>
+        </w:tabs>
+        <w:rPr>
+          <w:rFonts w:eastAsiaTheme="minorEastAsia"/>
+          <w:noProof/>
+          <w:lang w:eastAsia="en-GB"/>
+        </w:rPr>
+      </w:pPr>
+      <w:r>
+        <w:rPr>
+          <w:rFonts w:ascii="Arial" w:hAnsi="Arial" w:cs="Arial"/>
+          <w:b/>
+          <w:bCs/>
+          <w:sz w:val="22"/>
+          <w:szCs w:val="22"/>
+        </w:rPr>
+        <w:fldChar w:fldCharType="begin"/>
+      </w:r>
+      <w:r>
+        <w:rPr>
+          <w:rFonts w:ascii="Arial" w:hAnsi="Arial" w:cs="Arial"/>
+          <w:b/>
+          <w:bCs/>
+          <w:sz w:val="22"/>
+          <w:szCs w:val="22"/>
+        </w:rPr>
+        <w:instrText xml:space="preserve"> TOC \h \z \c "Table" </w:instrText>
+      </w:r>
+      <w:r>
+        <w:rPr>
+          <w:rFonts w:ascii="Arial" w:hAnsi="Arial" w:cs="Arial"/>
+          <w:b/>
+          <w:bCs/>
+          <w:sz w:val="22"/>
+          <w:szCs w:val="22"/>
+        </w:rPr>
+        <w:fldChar w:fldCharType="separate"/>
+      </w:r>
+      <w:hyperlink w:anchor="_Toc212731797" w:history="1">
+        <w:r>
+          <w:rPr>
+            <w:rStyle w:val="Hyperlink"/>
+            <w:noProof/>
+          </w:rPr>
+          <w:t>Table 1: Risk Assessment and Mitigation</w:t>
+        </w:r>
+        <w:r>
+          <w:rPr>
+            <w:noProof/>
+            <w:webHidden/>
+          </w:rPr>
+          <w:tab/>
+        </w:r>
+        <w:r>
+          <w:rPr>
+            <w:noProof/>
+            <w:webHidden/>
+          </w:rPr>
+          <w:fldChar w:fldCharType="begin"/>
+        </w:r>
+        <w:r>
+          <w:rPr>
+            <w:noProof/>
+            <w:webHidden/>
+          </w:rPr>
+          <w:instrText xml:space="preserve"> PAGEREF _Toc212731797 \h </w:instrText>
+        </w:r>
+        <w:r>
+          <w:rPr>
+            <w:noProof/>
+            <w:webHidden/>
+          </w:rPr>
+        </w:r>
+        <w:r>
+          <w:rPr>
+            <w:noProof/>
+            <w:webHidden/>
+          </w:rPr>
+          <w:fldChar w:fldCharType="separate"/>
+        </w:r>
+        <w:r>
+          <w:rPr>
+            <w:noProof/>
+            <w:webHidden/>
+          </w:rPr>
+          <w:t>1</w:t>
+        </w:r>
+        <w:r>
+          <w:rPr>
+            <w:noProof/>
+            <w:webHidden/>
+          </w:rPr>
+          <w:fldChar w:fldCharType="end"/>
+        </w:r>
+      </w:hyperlink>
+    </w:p>
+    <w:p>
+      <w:pPr>
+        <w:rPr>
+          <w:rFonts w:ascii="Arial" w:hAnsi="Arial" w:cs="Arial"/>
+          <w:b/>
+          <w:bCs/>
+          <w:sz w:val="22"/>
+          <w:szCs w:val="22"/>
+        </w:rPr>
+      </w:pPr>
+      <w:r>
+        <w:rPr>
+          <w:rFonts w:ascii="Arial" w:hAnsi="Arial" w:cs="Arial"/>
+          <w:b/>
+          <w:bCs/>
+          <w:sz w:val="22"/>
+          <w:szCs w:val="22"/>
+        </w:rPr>
+        <w:fldChar w:fldCharType="end"/>
+      </w:r>
+    </w:p>
+    <w:p>
+      <w:pPr>
         <w:pStyle w:val="Heading1"/>
       </w:pPr>
       <w:r>
@@ -3181,13 +3467,6 @@
       <w:r>
         <w:t>e difference between them.</w:t>
       </w:r>
-      <w:r>
-        <w:rPr>
-          <w:i/>
-          <w:iCs/>
-        </w:rPr>
-        <w:br/>
-      </w:r>
     </w:p>
     <w:p>
       <w:pPr>
@@ -3213,7 +3492,88 @@
         <w:t xml:space="preserve"> become and emerging yet ambiguously defined genre </w:t>
       </w:r>
       <w:r>
-        <w:t>in recent years. Titles such as previously mentioned Animal Crossing: New Horizons, Stardew Valley and A Little to the Left have redefined what constitutes</w:t>
+        <w:t xml:space="preserve">in recent years. Titles such as previously mentioned </w:t>
+      </w:r>
+      <w:r>
+        <w:t>“</w:t>
+      </w:r>
+      <w:r>
+        <w:t>Animal Crossing: New Horizons</w:t>
+      </w:r>
+      <w:r>
+        <w:t>”</w:t>
+      </w:r>
+      <w:r>
+        <w:t xml:space="preserve"> </w:t>
+      </w:r>
+      <w:r>
+        <w:t>(</w:t>
+      </w:r>
+      <w:r>
+        <w:rPr>
+          <w:highlight w:val="yellow"/>
+        </w:rPr>
+        <w:t>INSERT REFERENCE</w:t>
+      </w:r>
+      <w:r>
+        <w:t>)</w:t>
+      </w:r>
+      <w:r>
+        <w:t xml:space="preserve">, </w:t>
+      </w:r>
+      <w:r>
+        <w:t>“</w:t>
+      </w:r>
+      <w:r>
+        <w:t>Stardew Valley</w:t>
+      </w:r>
+      <w:r>
+        <w:t>”</w:t>
+      </w:r>
+      <w:r>
+        <w:t xml:space="preserve"> </w:t>
+      </w:r>
+      <w:r>
+        <w:t>(</w:t>
+      </w:r>
+      <w:r>
+        <w:rPr>
+          <w:highlight w:val="yellow"/>
+        </w:rPr>
+        <w:t>INSERT REFERENCE</w:t>
+      </w:r>
+      <w:r>
+        <w:t>)</w:t>
+      </w:r>
+      <w:r>
+        <w:t xml:space="preserve"> and </w:t>
+      </w:r>
+      <w:r>
+        <w:t>“</w:t>
+      </w:r>
+      <w:r>
+        <w:t>A Little to the Left</w:t>
+      </w:r>
+      <w:r>
+        <w:t>”</w:t>
+      </w:r>
+      <w:r>
+        <w:t xml:space="preserve"> </w:t>
+      </w:r>
+      <w:r>
+        <w:t>(</w:t>
+      </w:r>
+      <w:r>
+        <w:rPr>
+          <w:highlight w:val="yellow"/>
+        </w:rPr>
+        <w:t>INSERT REFERENCE</w:t>
+      </w:r>
+      <w:r>
+        <w:t>)</w:t>
+      </w:r>
+      <w:r>
+        <w:t xml:space="preserve"> have redefined what constitutes</w:t>
       </w:r>
       <w:r>
         <w:t xml:space="preserve"> a game being classified as part of the cozy games genre by prioritising the emotional safety, comfort and gentle interaction within the game world rather than the traditional challenge or competition. </w:t>
@@ -3485,6 +3845,24 @@
         <w:t xml:space="preserve">’s thesis </w:t>
       </w:r>
       <w:r>
+        <w:t>(</w:t>
+      </w:r>
+      <w:r>
+        <w:rPr>
+          <w:highlight w:val="yellow"/>
+        </w:rPr>
+        <w:t xml:space="preserve">INSERT </w:t>
+      </w:r>
+      <w:r>
+        <w:rPr>
+          <w:highlight w:val="yellow"/>
+        </w:rPr>
+        <w:t>SOURCE HERE</w:t>
+      </w:r>
+      <w:r>
+        <w:t xml:space="preserve">) </w:t>
+      </w:r>
+      <w:r>
         <w:t xml:space="preserve">attempts to identify the </w:t>
       </w:r>
       <w:r>
@@ -3494,7 +3872,76 @@
         <w:t xml:space="preserve"> </w:t>
       </w:r>
       <w:r>
-        <w:t xml:space="preserve">Through studies of Animal Crossing: New Horizons, Stardew Valley and A Short Hike, the author highlights common characteristics between each game such as the gentle pacing, safety and positive </w:t>
+        <w:t xml:space="preserve">Through studies of </w:t>
+      </w:r>
+      <w:r>
+        <w:t>“</w:t>
+      </w:r>
+      <w:r>
+        <w:t>Animal Crossing: New Horizons</w:t>
+      </w:r>
+      <w:r>
+        <w:t>” (</w:t>
+      </w:r>
+      <w:r>
+        <w:rPr>
+          <w:highlight w:val="yellow"/>
+        </w:rPr>
+        <w:t>INSERT REFERENCE</w:t>
+      </w:r>
+      <w:r>
+        <w:t>)</w:t>
+      </w:r>
+      <w:r>
+        <w:t xml:space="preserve">, </w:t>
+      </w:r>
+      <w:r>
+        <w:t>“</w:t>
+      </w:r>
+      <w:r>
+        <w:t>Stardew Valley</w:t>
+      </w:r>
+      <w:r>
+        <w:t xml:space="preserve">” </w:t>
+      </w:r>
+      <w:r>
+        <w:t>(</w:t>
+      </w:r>
+      <w:r>
+        <w:rPr>
+          <w:highlight w:val="yellow"/>
+        </w:rPr>
+        <w:t>INSERT REFERENCE</w:t>
+      </w:r>
+      <w:r>
+        <w:t>)</w:t>
+      </w:r>
+      <w:r>
+        <w:t xml:space="preserve"> and </w:t>
+      </w:r>
+      <w:r>
+        <w:t>“</w:t>
+      </w:r>
+      <w:r>
+        <w:t>A Short Hike</w:t>
+      </w:r>
+      <w:r>
+        <w:t xml:space="preserve">” </w:t>
+      </w:r>
+      <w:r>
+        <w:t>(</w:t>
+      </w:r>
+      <w:r>
+        <w:rPr>
+          <w:highlight w:val="yellow"/>
+        </w:rPr>
+        <w:t>INSERT REFERENCE</w:t>
+      </w:r>
+      <w:r>
+        <w:t>)</w:t>
+      </w:r>
+      <w:r>
+        <w:t xml:space="preserve">, the author highlights common characteristics between each game such as the gentle pacing, safety and positive </w:t>
       </w:r>
       <w:r>
         <w:t>reinforcement. The study argues that these features</w:t>
@@ -3510,6 +3957,208 @@
       </w:r>
       <w:r>
         <w:t>whether simplification dilutes a game’s identity.</w:t>
+      </w:r>
+    </w:p>
+    <w:p>
+      <w:pPr>
+        <w:pStyle w:val="Heading3"/>
+      </w:pPr>
+      <w:r>
+        <w:t>2.0.1.</w:t>
+      </w:r>
+      <w:r>
+        <w:t xml:space="preserve">3 </w:t>
+      </w:r>
+      <w:r>
+        <w:t>How COVID-19 Affected</w:t>
+      </w:r>
+      <w:r>
+        <w:t xml:space="preserve"> the Gaming Sphere</w:t>
+      </w:r>
+    </w:p>
+    <w:p>
+      <w:r>
+        <w:t>Fang’s thesis</w:t>
+      </w:r>
+      <w:r>
+        <w:t xml:space="preserve"> </w:t>
+      </w:r>
+      <w:r>
+        <w:t>(</w:t>
+      </w:r>
+      <w:r>
+        <w:rPr>
+          <w:highlight w:val="yellow"/>
+        </w:rPr>
+        <w:t>INSERT SOURCE HERE</w:t>
+      </w:r>
+      <w:r>
+        <w:t xml:space="preserve">) </w:t>
+      </w:r>
+      <w:r>
+        <w:t>analyse</w:t>
+      </w:r>
+      <w:r>
+        <w:t>d</w:t>
+      </w:r>
+      <w:r>
+        <w:t xml:space="preserve"> </w:t>
+      </w:r>
+      <w:r>
+        <w:t>how</w:t>
+      </w:r>
+      <w:r>
+        <w:t xml:space="preserve"> </w:t>
+      </w:r>
+      <w:r>
+        <w:t xml:space="preserve">cozy games </w:t>
+      </w:r>
+      <w:r>
+        <w:t>influenced the players</w:t>
+      </w:r>
+      <w:r>
+        <w:t>’</w:t>
+      </w:r>
+      <w:r>
+        <w:t xml:space="preserve"> well-being during the global pandemic “COVID-19”.</w:t>
+      </w:r>
+      <w:r>
+        <w:t xml:space="preserve"> The thesis found that</w:t>
+      </w:r>
+      <w:r>
+        <w:t xml:space="preserve"> </w:t>
+      </w:r>
+      <w:r>
+        <w:t xml:space="preserve">gaming during this </w:t>
+      </w:r>
+      <w:r>
+        <w:t>period</w:t>
+      </w:r>
+      <w:r>
+        <w:t xml:space="preserve"> </w:t>
+      </w:r>
+      <w:r>
+        <w:t xml:space="preserve">produced predominantly positive outcomes, </w:t>
+      </w:r>
+      <w:r>
+        <w:t>particularly in social connection and emotional health</w:t>
+      </w:r>
+      <w:r>
+        <w:t>.</w:t>
+      </w:r>
+      <w:r>
+        <w:t xml:space="preserve"> </w:t>
+      </w:r>
+      <w:r>
+        <w:t xml:space="preserve">Through qualitative </w:t>
+      </w:r>
+      <w:r>
+        <w:t>interviews</w:t>
+      </w:r>
+      <w:r>
+        <w:t xml:space="preserve"> with Chinese international students, </w:t>
+      </w:r>
+      <w:r>
+        <w:t>Fang (</w:t>
+      </w:r>
+      <w:r>
+        <w:rPr>
+          <w:highlight w:val="yellow"/>
+        </w:rPr>
+        <w:t xml:space="preserve">INSERT SOURCE </w:t>
+      </w:r>
+      <w:r>
+        <w:rPr>
+          <w:highlight w:val="yellow"/>
+        </w:rPr>
+        <w:t>HERE</w:t>
+      </w:r>
+      <w:r>
+        <w:t>) demonstrates</w:t>
+      </w:r>
+      <w:r>
+        <w:t xml:space="preserve"> that cozy games </w:t>
+      </w:r>
+      <w:r>
+        <w:t>fostered</w:t>
+      </w:r>
+      <w:r>
+        <w:t xml:space="preserve"> a sense of emotional safety, belonging and cultural self-expression during the isolation period.</w:t>
+      </w:r>
+      <w:r>
+        <w:t xml:space="preserve"> </w:t>
+      </w:r>
+      <w:r>
+        <w:t>The thesis</w:t>
+      </w:r>
+      <w:r>
+        <w:t xml:space="preserve"> </w:t>
+      </w:r>
+      <w:r>
+        <w:t>applied</w:t>
+      </w:r>
+      <w:r>
+        <w:t xml:space="preserve"> the idea of Maslow’s hierarchy of </w:t>
+      </w:r>
+      <w:r>
+        <w:t>needs (</w:t>
+      </w:r>
+      <w:r>
+        <w:rPr>
+          <w:highlight w:val="yellow"/>
+        </w:rPr>
+        <w:t>INSERT SOURCE HERE</w:t>
+      </w:r>
+      <w:r>
+        <w:t xml:space="preserve">) </w:t>
+      </w:r>
+      <w:r>
+        <w:t xml:space="preserve">and General Strain Theory </w:t>
+      </w:r>
+      <w:r>
+        <w:t>(</w:t>
+      </w:r>
+      <w:r>
+        <w:rPr>
+          <w:highlight w:val="yellow"/>
+        </w:rPr>
+        <w:t>INSERT SOURCE HERE</w:t>
+      </w:r>
+      <w:r>
+        <w:t xml:space="preserve">) </w:t>
+      </w:r>
+      <w:r>
+        <w:t>to argue that cozy games</w:t>
+      </w:r>
+      <w:r>
+        <w:t xml:space="preserve"> functioned as </w:t>
+      </w:r>
+      <w:r>
+        <w:t>technologies for escapism and an effective coping mechanism</w:t>
+      </w:r>
+      <w:r>
+        <w:t xml:space="preserve">. </w:t>
+      </w:r>
+      <w:r>
+        <w:t>However</w:t>
+      </w:r>
+      <w:r>
+        <w:t xml:space="preserve">, </w:t>
+      </w:r>
+      <w:r>
+        <w:t xml:space="preserve">it positioned cozy games as a primary tool for psychological and social stability during this period. </w:t>
+      </w:r>
+      <w:r>
+        <w:t xml:space="preserve">As a result, Fang’s analysis highlighted the growing tension within the genre: as comfort and safety become main design goals, the interactive and ludic elements that </w:t>
+      </w:r>
+      <w:r>
+        <w:t xml:space="preserve">traditionally define games risk being overthrown. This tension </w:t>
+      </w:r>
+      <w:r>
+        <w:t>aligns directly with the overarching concern of determining where the balance lies between coziness and play</w:t>
+      </w:r>
+      <w:r>
+        <w:t>.</w:t>
       </w:r>
     </w:p>
     <w:p>
@@ -4642,7 +5291,10 @@
         <w:t>Fig</w:t>
       </w:r>
       <w:r>
-        <w:t xml:space="preserve"> 1.1</w:t>
+        <w:t>ure</w:t>
+      </w:r>
+      <w:r>
+        <w:t xml:space="preserve"> 1</w:t>
       </w:r>
       <w:r>
         <w:t>) provides a visual representation of the overall timeline, illustrating task durations and milestones. This will help ensure that major phases throughout the project</w:t>
@@ -4695,54 +5347,47 @@
     </w:p>
     <w:p>
       <w:pPr>
+        <w:pStyle w:val="Caption"/>
         <w:rPr>
           <w:sz w:val="16"/>
           <w:szCs w:val="16"/>
         </w:rPr>
       </w:pPr>
-      <w:r>
-        <w:rPr>
-          <w:sz w:val="16"/>
-          <w:szCs w:val="16"/>
-        </w:rPr>
-        <w:t xml:space="preserve">Fig </w:t>
-      </w:r>
-      <w:r>
-        <w:rPr>
-          <w:sz w:val="16"/>
-          <w:szCs w:val="16"/>
-        </w:rPr>
-        <w:t>1</w:t>
-      </w:r>
-      <w:r>
-        <w:rPr>
-          <w:sz w:val="16"/>
-          <w:szCs w:val="16"/>
-        </w:rPr>
-        <w:t>.1</w:t>
-      </w:r>
-      <w:r>
-        <w:rPr>
-          <w:sz w:val="16"/>
-          <w:szCs w:val="16"/>
-        </w:rPr>
+      <w:bookmarkStart w:id="29" w:name="_Toc212731684"/>
+      <w:r>
+        <w:t xml:space="preserve">Figure </w:t>
+      </w:r>
+      <w:fldSimple w:instr=" SEQ Figure \* ARABIC ">
+        <w:r>
+          <w:rPr>
+            <w:noProof/>
+          </w:rPr>
+          <w:t>1</w:t>
+        </w:r>
+      </w:fldSimple>
+      <w:r>
         <w:t>: Example of Gantt Chart</w:t>
       </w:r>
-    </w:p>
-    <w:p>
-      <w:pPr>
-        <w:rPr>
-          <w:sz w:val="16"/>
-          <w:szCs w:val="16"/>
-        </w:rPr>
-      </w:pPr>
+      <w:bookmarkEnd w:id="29"/>
     </w:p>
     <w:p>
       <w:r>
         <w:t>The Kanban board</w:t>
       </w:r>
       <w:r>
-        <w:t xml:space="preserve"> (Fig 1.2)</w:t>
+        <w:t xml:space="preserve"> (Fig</w:t>
+      </w:r>
+      <w:r>
+        <w:t>ure</w:t>
+      </w:r>
+      <w:r>
+        <w:t xml:space="preserve"> </w:t>
+      </w:r>
+      <w:r>
+        <w:t>2</w:t>
+      </w:r>
+      <w:r>
+        <w:t>)</w:t>
       </w:r>
       <w:r>
         <w:t xml:space="preserve"> will be in harmony with the Gantt Chart by providing a </w:t>
@@ -4831,26 +5476,28 @@
     </w:p>
     <w:p>
       <w:pPr>
+        <w:pStyle w:val="Caption"/>
         <w:rPr>
           <w:sz w:val="16"/>
           <w:szCs w:val="16"/>
         </w:rPr>
       </w:pPr>
-      <w:r>
-        <w:rPr>
-          <w:sz w:val="16"/>
-          <w:szCs w:val="16"/>
-        </w:rPr>
-        <w:t>Fig 1.2: Example of Kanban board</w:t>
-      </w:r>
-    </w:p>
-    <w:p>
-      <w:pPr>
-        <w:rPr>
-          <w:sz w:val="16"/>
-          <w:szCs w:val="16"/>
-        </w:rPr>
-      </w:pPr>
+      <w:bookmarkStart w:id="30" w:name="_Toc212731685"/>
+      <w:r>
+        <w:t xml:space="preserve">Figure </w:t>
+      </w:r>
+      <w:fldSimple w:instr=" SEQ Figure \* ARABIC ">
+        <w:r>
+          <w:rPr>
+            <w:noProof/>
+          </w:rPr>
+          <w:t>2</w:t>
+        </w:r>
+      </w:fldSimple>
+      <w:r>
+        <w:t>: Example of Kanban Board</w:t>
+      </w:r>
+      <w:bookmarkEnd w:id="30"/>
     </w:p>
     <w:p>
       <w:r>
@@ -4910,21 +5557,21 @@
       <w:pPr>
         <w:pStyle w:val="Heading1"/>
       </w:pPr>
-      <w:bookmarkStart w:id="29" w:name="_Toc212714949"/>
+      <w:bookmarkStart w:id="31" w:name="_Toc212714949"/>
       <w:r>
         <w:t>5.0 Feasibility, Risks, and Ethical Aspects</w:t>
       </w:r>
-      <w:bookmarkEnd w:id="29"/>
+      <w:bookmarkEnd w:id="31"/>
     </w:p>
     <w:p>
       <w:pPr>
         <w:pStyle w:val="Heading2"/>
       </w:pPr>
-      <w:bookmarkStart w:id="30" w:name="_Toc212714950"/>
+      <w:bookmarkStart w:id="32" w:name="_Toc212714950"/>
       <w:r>
         <w:t>5.1 Feasibility</w:t>
       </w:r>
-      <w:bookmarkEnd w:id="30"/>
+      <w:bookmarkEnd w:id="32"/>
     </w:p>
     <w:p>
       <w:r>
@@ -5003,11 +5650,11 @@
       <w:pPr>
         <w:pStyle w:val="Heading2"/>
       </w:pPr>
-      <w:bookmarkStart w:id="31" w:name="_Toc212714951"/>
+      <w:bookmarkStart w:id="33" w:name="_Toc212714951"/>
       <w:r>
         <w:t>5.2 Risk Analysis and Mitigation</w:t>
       </w:r>
-      <w:bookmarkEnd w:id="31"/>
+      <w:bookmarkEnd w:id="33"/>
     </w:p>
     <w:p/>
     <w:tbl>
@@ -6209,31 +6856,48 @@
         <w:tabs>
           <w:tab w:val="left" w:pos="3412"/>
         </w:tabs>
-        <w:jc w:val="center"/>
         <w:rPr>
           <w:rFonts w:ascii="Arial" w:hAnsi="Arial" w:cs="Arial"/>
           <w:sz w:val="22"/>
           <w:szCs w:val="22"/>
         </w:rPr>
       </w:pPr>
-      <w:r>
+    </w:p>
+    <w:p>
+      <w:pPr>
+        <w:pStyle w:val="Caption"/>
         <w:rPr>
           <w:rFonts w:ascii="Arial" w:hAnsi="Arial" w:cs="Arial"/>
           <w:sz w:val="22"/>
           <w:szCs w:val="22"/>
         </w:rPr>
-        <w:t>Table 4.1: Risk Assessment and Mitigation</w:t>
-      </w:r>
+      </w:pPr>
+      <w:bookmarkStart w:id="34" w:name="_Toc212731797"/>
+      <w:r>
+        <w:t xml:space="preserve">Table </w:t>
+      </w:r>
+      <w:fldSimple w:instr=" SEQ Table \* ARABIC ">
+        <w:r>
+          <w:rPr>
+            <w:noProof/>
+          </w:rPr>
+          <w:t>1</w:t>
+        </w:r>
+      </w:fldSimple>
+      <w:r>
+        <w:t>: Risk Assessment and Mitigation</w:t>
+      </w:r>
+      <w:bookmarkEnd w:id="34"/>
     </w:p>
     <w:p>
       <w:pPr>
         <w:pStyle w:val="Heading2"/>
       </w:pPr>
-      <w:bookmarkStart w:id="32" w:name="_Toc212714952"/>
+      <w:bookmarkStart w:id="35" w:name="_Toc212714952"/>
       <w:r>
         <w:t>5.3 Ethical Considerations</w:t>
       </w:r>
-      <w:bookmarkEnd w:id="32"/>
+      <w:bookmarkEnd w:id="35"/>
     </w:p>
     <w:p>
       <w:pPr>
@@ -6282,21 +6946,21 @@
       <w:pPr>
         <w:pStyle w:val="Heading1"/>
       </w:pPr>
-      <w:bookmarkStart w:id="33" w:name="_Toc212714953"/>
+      <w:bookmarkStart w:id="36" w:name="_Toc212714953"/>
       <w:r>
         <w:t>References</w:t>
       </w:r>
-      <w:bookmarkEnd w:id="33"/>
+      <w:bookmarkEnd w:id="36"/>
     </w:p>
     <w:p>
       <w:pPr>
         <w:pStyle w:val="Heading1"/>
       </w:pPr>
-      <w:bookmarkStart w:id="34" w:name="_Toc212714954"/>
+      <w:bookmarkStart w:id="37" w:name="_Toc212714954"/>
       <w:r>
         <w:t>Appendices (Optional)</w:t>
       </w:r>
-      <w:bookmarkEnd w:id="34"/>
+      <w:bookmarkEnd w:id="37"/>
     </w:p>
     <w:p>
       <w:pPr>
@@ -6306,14 +6970,6 @@
           <w:szCs w:val="22"/>
         </w:rPr>
       </w:pPr>
-      <w:r>
-        <w:rPr>
-          <w:rFonts w:ascii="Arial" w:hAnsi="Arial" w:cs="Arial"/>
-          <w:sz w:val="22"/>
-          <w:szCs w:val="22"/>
-        </w:rPr>
-        <w:t>Include any additional material here, such as review steps, specifications, and methodologies.</w:t>
-      </w:r>
     </w:p>
     <w:sectPr>
       <w:headerReference w:type="default" r:id="rId13"/>
@@ -8074,6 +8730,36 @@
       <w:u w:val="single"/>
     </w:rPr>
   </w:style>
+  <w:style w:type="paragraph" w:styleId="Caption">
+    <w:name w:val="caption"/>
+    <w:basedOn w:val="Normal"/>
+    <w:next w:val="Normal"/>
+    <w:uiPriority w:val="35"/>
+    <w:unhideWhenUsed/>
+    <w:qFormat/>
+    <w:rsid w:val="00E56C51"/>
+    <w:pPr>
+      <w:spacing w:after="200" w:line="240" w:lineRule="auto"/>
+    </w:pPr>
+    <w:rPr>
+      <w:i/>
+      <w:iCs/>
+      <w:color w:val="0E2841" w:themeColor="text2"/>
+      <w:sz w:val="18"/>
+      <w:szCs w:val="18"/>
+    </w:rPr>
+  </w:style>
+  <w:style w:type="paragraph" w:styleId="TableofFigures">
+    <w:name w:val="table of figures"/>
+    <w:basedOn w:val="Normal"/>
+    <w:next w:val="Normal"/>
+    <w:uiPriority w:val="99"/>
+    <w:unhideWhenUsed/>
+    <w:rsid w:val="00BE57DA"/>
+    <w:pPr>
+      <w:spacing w:after="0"/>
+    </w:pPr>
+  </w:style>
 </w:styles>
 </file>
 
@@ -8393,19 +9079,6 @@
 </file>
 
 <file path=customXml/item1.xml><?xml version="1.0" encoding="utf-8"?>
-<b:Sources xmlns:b="http://schemas.openxmlformats.org/officeDocument/2006/bibliography" xmlns="http://schemas.openxmlformats.org/officeDocument/2006/bibliography" SelectedStyle="\APASixthEditionOfficeOnline.xsl" StyleName="APA" Version="6"/>
-</file>
-
-<file path=customXml/item2.xml><?xml version="1.0" encoding="utf-8"?>
-<?mso-contentType ?>
-<FormTemplates xmlns="http://schemas.microsoft.com/sharepoint/v3/contenttype/forms">
-  <Display>DocumentLibraryForm</Display>
-  <Edit>DocumentLibraryForm</Edit>
-  <New>DocumentLibraryForm</New>
-</FormTemplates>
-</file>
-
-<file path=customXml/item3.xml><?xml version="1.0" encoding="utf-8"?>
 <ct:contentTypeSchema xmlns:ct="http://schemas.microsoft.com/office/2006/metadata/contentType" xmlns:ma="http://schemas.microsoft.com/office/2006/metadata/properties/metaAttributes" ct:_="" ma:_="" ma:contentTypeName="Document" ma:contentTypeID="0x0101008F0F6E24CBBDF2489BB0C7D787BF1FA9" ma:contentTypeVersion="15" ma:contentTypeDescription="Create a new document." ma:contentTypeScope="" ma:versionID="2d4b1107e0bcd24d879f2e81b4ffe2f7">
   <xsd:schema xmlns:xsd="http://www.w3.org/2001/XMLSchema" xmlns:xs="http://www.w3.org/2001/XMLSchema" xmlns:p="http://schemas.microsoft.com/office/2006/metadata/properties" xmlns:ns3="4e6bee01-fae3-4e1c-8f1a-9ed0fe9197f3" xmlns:ns4="9ebee74b-6c09-439e-a20a-fc6d1b49bd2d" targetNamespace="http://schemas.microsoft.com/office/2006/metadata/properties" ma:root="true" ma:fieldsID="5cc5db8e17a87248a928f297a097d818" ns3:_="" ns4:_="">
     <xsd:import namespace="4e6bee01-fae3-4e1c-8f1a-9ed0fe9197f3"/>
@@ -8638,7 +9311,7 @@
 </ct:contentTypeSchema>
 </file>
 
-<file path=customXml/item4.xml><?xml version="1.0" encoding="utf-8"?>
+<file path=customXml/item2.xml><?xml version="1.0" encoding="utf-8"?>
 <p:properties xmlns:p="http://schemas.microsoft.com/office/2006/metadata/properties" xmlns:xsi="http://www.w3.org/2001/XMLSchema-instance" xmlns:pc="http://schemas.microsoft.com/office/infopath/2007/PartnerControls">
   <documentManagement>
     <_activity xmlns="4e6bee01-fae3-4e1c-8f1a-9ed0fe9197f3" xsi:nil="true"/>
@@ -8646,23 +9319,20 @@
 </p:properties>
 </file>
 
-<file path=customXml/itemProps1.xml><?xml version="1.0" encoding="utf-8"?>
-<ds:datastoreItem xmlns:ds="http://schemas.openxmlformats.org/officeDocument/2006/customXml" ds:itemID="{01737935-5D60-4040-8892-9E4074313170}">
-  <ds:schemaRefs>
-    <ds:schemaRef ds:uri="http://schemas.openxmlformats.org/officeDocument/2006/bibliography"/>
-  </ds:schemaRefs>
-</ds:datastoreItem>
+<file path=customXml/item3.xml><?xml version="1.0" encoding="utf-8"?>
+<b:Sources xmlns:b="http://schemas.openxmlformats.org/officeDocument/2006/bibliography" xmlns="http://schemas.openxmlformats.org/officeDocument/2006/bibliography" SelectedStyle="\APASixthEditionOfficeOnline.xsl" StyleName="APA" Version="6"/>
 </file>
 
-<file path=customXml/itemProps2.xml><?xml version="1.0" encoding="utf-8"?>
-<ds:datastoreItem xmlns:ds="http://schemas.openxmlformats.org/officeDocument/2006/customXml" ds:itemID="{E4A5EDD7-4E6F-4D6E-A621-24883E4CA807}">
-  <ds:schemaRefs>
-    <ds:schemaRef ds:uri="http://schemas.microsoft.com/sharepoint/v3/contenttype/forms"/>
-  </ds:schemaRefs>
-</ds:datastoreItem>
+<file path=customXml/item4.xml><?xml version="1.0" encoding="utf-8"?>
+<?mso-contentType ?>
+<FormTemplates xmlns="http://schemas.microsoft.com/sharepoint/v3/contenttype/forms">
+  <Display>DocumentLibraryForm</Display>
+  <Edit>DocumentLibraryForm</Edit>
+  <New>DocumentLibraryForm</New>
+</FormTemplates>
 </file>
 
-<file path=customXml/itemProps3.xml><?xml version="1.0" encoding="utf-8"?>
+<file path=customXml/itemProps1.xml><?xml version="1.0" encoding="utf-8"?>
 <ds:datastoreItem xmlns:ds="http://schemas.openxmlformats.org/officeDocument/2006/customXml" ds:itemID="{71FFA508-172B-43AC-84A2-26545FBF7306}">
   <ds:schemaRefs>
     <ds:schemaRef ds:uri="http://schemas.microsoft.com/office/2006/metadata/contentType"/>
@@ -8681,7 +9351,7 @@
 </ds:datastoreItem>
 </file>
 
-<file path=customXml/itemProps4.xml><?xml version="1.0" encoding="utf-8"?>
+<file path=customXml/itemProps2.xml><?xml version="1.0" encoding="utf-8"?>
 <ds:datastoreItem xmlns:ds="http://schemas.openxmlformats.org/officeDocument/2006/customXml" ds:itemID="{427E592C-BA00-4E9F-856E-27CA4AE42C28}">
   <ds:schemaRefs>
     <ds:schemaRef ds:uri="http://schemas.microsoft.com/office/2006/metadata/properties"/>
@@ -8689,4 +9359,20 @@
     <ds:schemaRef ds:uri="4e6bee01-fae3-4e1c-8f1a-9ed0fe9197f3"/>
   </ds:schemaRefs>
 </ds:datastoreItem>
+</file>
+
+<file path=customXml/itemProps3.xml><?xml version="1.0" encoding="utf-8"?>
+<ds:datastoreItem xmlns:ds="http://schemas.openxmlformats.org/officeDocument/2006/customXml" ds:itemID="{01737935-5D60-4040-8892-9E4074313170}">
+  <ds:schemaRefs>
+    <ds:schemaRef ds:uri="http://schemas.openxmlformats.org/officeDocument/2006/bibliography"/>
+  </ds:schemaRefs>
+</ds:datastoreItem>
+</file>
+
+<file path=customXml/itemProps4.xml><?xml version="1.0" encoding="utf-8"?>
+<ds:datastoreItem xmlns:ds="http://schemas.openxmlformats.org/officeDocument/2006/customXml" ds:itemID="{E4A5EDD7-4E6F-4D6E-A621-24883E4CA807}">
+  <ds:schemaRefs>
+    <ds:schemaRef ds:uri="http://schemas.microsoft.com/sharepoint/v3/contenttype/forms"/>
+  </ds:schemaRefs>
+</ds:datastoreItem>
 </file>
</xml_diff>

<commit_message>
3k words, need to add inline referencing
</commit_message>
<xml_diff>
--- a/[Vennce Bravo - 231402264] 25-26 Project Interim Report Template .docx
+++ b/[Vennce Bravo - 231402264] 25-26 Project Interim Report Template .docx
@@ -125,7 +125,7 @@
           </mc:Choice>
           <mc:Fallback>
             <w:pict>
-              <v:line w14:anchorId="15AF6D02" id="Straight Connector 12" o:spid="_x0000_s1026" style="position:absolute;z-index:251658240;visibility:visible;mso-wrap-style:square;mso-width-percent:0;mso-height-percent:0;mso-wrap-distance-left:9pt;mso-wrap-distance-top:0;mso-wrap-distance-right:9pt;mso-wrap-distance-bottom:0;mso-position-horizontal:absolute;mso-position-horizontal-relative:margin;mso-position-vertical:absolute;mso-position-vertical-relative:text;mso-width-percent:0;mso-height-percent:0;mso-width-relative:margin;mso-height-relative:margin" from="3.2pt,9.85pt" to="456.7pt,9.85pt" o:gfxdata="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" strokecolor="#0e2841 [3215]" strokeweight="2.25pt">
+              <v:line w14:anchorId="34C62327" id="Straight Connector 12" o:spid="_x0000_s1026" style="position:absolute;z-index:251658240;visibility:visible;mso-wrap-style:square;mso-width-percent:0;mso-height-percent:0;mso-wrap-distance-left:9pt;mso-wrap-distance-top:0;mso-wrap-distance-right:9pt;mso-wrap-distance-bottom:0;mso-position-horizontal:absolute;mso-position-horizontal-relative:margin;mso-position-vertical:absolute;mso-position-vertical-relative:text;mso-width-percent:0;mso-height-percent:0;mso-width-relative:margin;mso-height-relative:margin" from="3.2pt,9.85pt" to="456.7pt,9.85pt" o:gfxdata="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" strokecolor="#0e2841 [3215]" strokeweight="2.25pt">
                 <v:stroke dashstyle="dash" opacity="50372f" linestyle="thinThin" endcap="round"/>
                 <v:shadow on="t" color="black" opacity="26214f" origin=",-.5" offset="0,3pt"/>
                 <w10:wrap anchorx="margin"/>
@@ -405,7 +405,7 @@
           </mc:Choice>
           <mc:Fallback>
             <w:pict>
-              <v:line w14:anchorId="53FE8B8E" id="Straight Connector 12" o:spid="_x0000_s1026" style="position:absolute;z-index:251658241;visibility:visible;mso-wrap-style:square;mso-width-percent:0;mso-height-percent:0;mso-wrap-distance-left:9pt;mso-wrap-distance-top:0;mso-wrap-distance-right:9pt;mso-wrap-distance-bottom:0;mso-position-horizontal:absolute;mso-position-horizontal-relative:margin;mso-position-vertical:absolute;mso-position-vertical-relative:text;mso-width-percent:0;mso-height-percent:0;mso-width-relative:margin;mso-height-relative:margin" from="3.8pt,24.3pt" to="457.3pt,24.3pt" o:gfxdata="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" strokecolor="#0e2841 [3215]" strokeweight="2.25pt">
+              <v:line w14:anchorId="3C74F8C5" id="Straight Connector 12" o:spid="_x0000_s1026" style="position:absolute;z-index:251658241;visibility:visible;mso-wrap-style:square;mso-width-percent:0;mso-height-percent:0;mso-wrap-distance-left:9pt;mso-wrap-distance-top:0;mso-wrap-distance-right:9pt;mso-wrap-distance-bottom:0;mso-position-horizontal:absolute;mso-position-horizontal-relative:margin;mso-position-vertical:absolute;mso-position-vertical-relative:text;mso-width-percent:0;mso-height-percent:0;mso-width-relative:margin;mso-height-relative:margin" from="3.8pt,24.3pt" to="457.3pt,24.3pt" o:gfxdata="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" strokecolor="#0e2841 [3215]" strokeweight="2.25pt">
                 <v:stroke dashstyle="dash" opacity="50372f" linestyle="thinThin" endcap="round"/>
                 <v:shadow on="t" color="black" opacity="26214f" origin=",-.5" offset="0,3pt"/>
                 <w10:wrap anchorx="margin"/>
@@ -3367,6 +3367,12 @@
       </w:r>
     </w:p>
     <w:p>
+      <w:pPr>
+        <w:rPr>
+          <w:sz w:val="16"/>
+          <w:szCs w:val="16"/>
+        </w:rPr>
+      </w:pPr>
       <w:r>
         <w:t xml:space="preserve">When </w:t>
       </w:r>
@@ -3388,6 +3394,13 @@
       <w:r>
         <w:t>virtual toy, simulator or an interactive environment?</w:t>
       </w:r>
+      <w:r>
+        <w:rPr>
+          <w:sz w:val="16"/>
+          <w:szCs w:val="16"/>
+        </w:rPr>
+        <w:t xml:space="preserve"> </w:t>
+      </w:r>
     </w:p>
     <w:p>
       <w:pPr>
@@ -3600,7 +3613,13 @@
         <w:t xml:space="preserve"> emotional design and </w:t>
       </w:r>
       <w:r>
-        <w:t>the ludic identity</w:t>
+        <w:t xml:space="preserve">the </w:t>
+      </w:r>
+      <w:r>
+        <w:t>play</w:t>
+      </w:r>
+      <w:r>
+        <w:t xml:space="preserve"> identity</w:t>
       </w:r>
       <w:r>
         <w:t xml:space="preserve"> to establish a foundation for examining when a cozy game might lose it</w:t>
@@ -3902,7 +3921,203 @@
         <w:t>Stardew Valley</w:t>
       </w:r>
       <w:r>
-        <w:t xml:space="preserve">” </w:t>
+        <w:t>” (</w:t>
+      </w:r>
+      <w:r>
+        <w:rPr>
+          <w:highlight w:val="yellow"/>
+        </w:rPr>
+        <w:t>INSERT REFERENCE</w:t>
+      </w:r>
+      <w:r>
+        <w:t>)</w:t>
+      </w:r>
+      <w:r>
+        <w:t xml:space="preserve"> and </w:t>
+      </w:r>
+      <w:r>
+        <w:t>“</w:t>
+      </w:r>
+      <w:r>
+        <w:t>A Short Hike</w:t>
+      </w:r>
+      <w:r>
+        <w:t>” (</w:t>
+      </w:r>
+      <w:r>
+        <w:rPr>
+          <w:highlight w:val="yellow"/>
+        </w:rPr>
+        <w:t>INSERT REFERENCE</w:t>
+      </w:r>
+      <w:r>
+        <w:t>)</w:t>
+      </w:r>
+      <w:r>
+        <w:t xml:space="preserve">, the author highlights common characteristics between each game such as the gentle pacing, safety and positive </w:t>
+      </w:r>
+      <w:r>
+        <w:t>reinforcement. The study argues that these features</w:t>
+      </w:r>
+      <w:r>
+        <w:t xml:space="preserve"> assist to shift the focus of the player from mechanics mastery to emotional comfort, aligning with the notion of “low-stakes</w:t>
+      </w:r>
+      <w:r>
+        <w:t xml:space="preserve"> interactivity”. While the thesis helps define structural pillars in design for cozy game identity, it also outlines the tension between comfort and challenge.</w:t>
+      </w:r>
+      <w:r>
+        <w:t xml:space="preserve"> This raises the question of </w:t>
+      </w:r>
+      <w:r>
+        <w:t>whether simplification dilutes a game’s identity.</w:t>
+      </w:r>
+    </w:p>
+    <w:p>
+      <w:pPr>
+        <w:pStyle w:val="Heading3"/>
+      </w:pPr>
+      <w:r>
+        <w:t>2.0.1.</w:t>
+      </w:r>
+      <w:r>
+        <w:t xml:space="preserve">3 </w:t>
+      </w:r>
+      <w:r>
+        <w:t>How COVID-19 Affected</w:t>
+      </w:r>
+      <w:r>
+        <w:t xml:space="preserve"> the Gaming Sphere</w:t>
+      </w:r>
+    </w:p>
+    <w:p>
+      <w:r>
+        <w:t>Fang’s thesis</w:t>
+      </w:r>
+      <w:r>
+        <w:t xml:space="preserve"> (</w:t>
+      </w:r>
+      <w:r>
+        <w:rPr>
+          <w:highlight w:val="yellow"/>
+        </w:rPr>
+        <w:t>INSERT SOURCE HERE</w:t>
+      </w:r>
+      <w:r>
+        <w:t xml:space="preserve">) </w:t>
+      </w:r>
+      <w:r>
+        <w:t>analyse</w:t>
+      </w:r>
+      <w:r>
+        <w:t>d</w:t>
+      </w:r>
+      <w:r>
+        <w:t xml:space="preserve"> </w:t>
+      </w:r>
+      <w:r>
+        <w:t>how</w:t>
+      </w:r>
+      <w:r>
+        <w:t xml:space="preserve"> </w:t>
+      </w:r>
+      <w:r>
+        <w:t xml:space="preserve">cozy games </w:t>
+      </w:r>
+      <w:r>
+        <w:t>influenced the players</w:t>
+      </w:r>
+      <w:r>
+        <w:t>’</w:t>
+      </w:r>
+      <w:r>
+        <w:t xml:space="preserve"> well-being during the global pandemic “COVID-19”.</w:t>
+      </w:r>
+      <w:r>
+        <w:t xml:space="preserve"> The thesis found that</w:t>
+      </w:r>
+      <w:r>
+        <w:t xml:space="preserve"> </w:t>
+      </w:r>
+      <w:r>
+        <w:t xml:space="preserve">gaming during this </w:t>
+      </w:r>
+      <w:r>
+        <w:t>period</w:t>
+      </w:r>
+      <w:r>
+        <w:t xml:space="preserve"> </w:t>
+      </w:r>
+      <w:r>
+        <w:t xml:space="preserve">produced predominantly positive outcomes, </w:t>
+      </w:r>
+      <w:r>
+        <w:t>particularly in social connection and emotional health</w:t>
+      </w:r>
+      <w:r>
+        <w:t>.</w:t>
+      </w:r>
+      <w:r>
+        <w:t xml:space="preserve"> </w:t>
+      </w:r>
+      <w:r>
+        <w:t xml:space="preserve">Through qualitative </w:t>
+      </w:r>
+      <w:r>
+        <w:t>interviews</w:t>
+      </w:r>
+      <w:r>
+        <w:t xml:space="preserve"> with Chinese international students, </w:t>
+      </w:r>
+      <w:r>
+        <w:t>Fang (</w:t>
+      </w:r>
+      <w:r>
+        <w:rPr>
+          <w:highlight w:val="yellow"/>
+        </w:rPr>
+        <w:t>INSERT SOURCE HERE</w:t>
+      </w:r>
+      <w:r>
+        <w:t>) demonstrates</w:t>
+      </w:r>
+      <w:r>
+        <w:t xml:space="preserve"> that cozy games </w:t>
+      </w:r>
+      <w:r>
+        <w:t>fostered</w:t>
+      </w:r>
+      <w:r>
+        <w:t xml:space="preserve"> a sense of emotional safety, belonging and cultural self-expression during the isolation period.</w:t>
+      </w:r>
+      <w:r>
+        <w:t xml:space="preserve"> </w:t>
+      </w:r>
+      <w:r>
+        <w:t>The thesis</w:t>
+      </w:r>
+      <w:r>
+        <w:t xml:space="preserve"> </w:t>
+      </w:r>
+      <w:r>
+        <w:t>applied</w:t>
+      </w:r>
+      <w:r>
+        <w:t xml:space="preserve"> the idea of Maslow’s hierarchy of </w:t>
+      </w:r>
+      <w:r>
+        <w:t>needs (</w:t>
+      </w:r>
+      <w:r>
+        <w:rPr>
+          <w:highlight w:val="yellow"/>
+        </w:rPr>
+        <w:t>INSERT SOURCE HERE</w:t>
+      </w:r>
+      <w:r>
+        <w:t xml:space="preserve">) </w:t>
+      </w:r>
+      <w:r>
+        <w:t xml:space="preserve">and General Strain Theory </w:t>
       </w:r>
       <w:r>
         <w:t>(</w:t>
@@ -3911,287 +4126,325 @@
         <w:rPr>
           <w:highlight w:val="yellow"/>
         </w:rPr>
-        <w:t>INSERT REFERENCE</w:t>
+        <w:t>INSERT SOURCE HERE</w:t>
+      </w:r>
+      <w:r>
+        <w:t xml:space="preserve">) </w:t>
+      </w:r>
+      <w:r>
+        <w:t>to argue that cozy games</w:t>
+      </w:r>
+      <w:r>
+        <w:t xml:space="preserve"> functioned as </w:t>
+      </w:r>
+      <w:r>
+        <w:t>technologies for escapism and an effective coping mechanism</w:t>
+      </w:r>
+      <w:r>
+        <w:t xml:space="preserve">. </w:t>
+      </w:r>
+      <w:r>
+        <w:t>However</w:t>
+      </w:r>
+      <w:r>
+        <w:t xml:space="preserve">, </w:t>
+      </w:r>
+      <w:r>
+        <w:t xml:space="preserve">it positioned cozy games as a primary tool for psychological and social stability during this period. </w:t>
+      </w:r>
+      <w:r>
+        <w:t xml:space="preserve">As a result, Fang’s analysis highlighted the growing tension within the genre: as comfort and safety become main design goals, the interactive and </w:t>
+      </w:r>
+      <w:r>
+        <w:t>play</w:t>
+      </w:r>
+      <w:r>
+        <w:t xml:space="preserve"> elements that </w:t>
+      </w:r>
+      <w:r>
+        <w:t xml:space="preserve">traditionally define games risk being overthrown. This tension </w:t>
+      </w:r>
+      <w:r>
+        <w:t>aligns directly with the overarching concern of determining where the balance lies between coziness and play</w:t>
+      </w:r>
+      <w:r>
+        <w:t>.</w:t>
+      </w:r>
+    </w:p>
+    <w:p>
+      <w:pPr>
+        <w:pStyle w:val="Heading2"/>
+      </w:pPr>
+      <w:bookmarkStart w:id="13" w:name="_Toc212714933"/>
+      <w:r>
+        <w:t>2.</w:t>
+      </w:r>
+      <w:r>
+        <w:t>1</w:t>
+      </w:r>
+      <w:r>
+        <w:t xml:space="preserve"> Critical Analysis and Gap Identification</w:t>
+      </w:r>
+      <w:bookmarkEnd w:id="13"/>
+    </w:p>
+    <w:p>
+      <w:r>
+        <w:t xml:space="preserve">Existing academic literature establishes that cozy games are an effective medium </w:t>
+      </w:r>
+      <w:r>
+        <w:t>for emotionally driven experiences defined by design principles such as safety,</w:t>
+      </w:r>
+      <w:r>
+        <w:t xml:space="preserve"> warmth and low-stakes interactions.</w:t>
+      </w:r>
+      <w:r>
+        <w:t xml:space="preserve"> Researchers mutually agree that cozy games </w:t>
+      </w:r>
+      <w:r>
+        <w:t>do</w:t>
+      </w:r>
+      <w:r>
+        <w:t xml:space="preserve"> foster well-being</w:t>
+      </w:r>
+      <w:r>
+        <w:t xml:space="preserve"> and comfort during periods of social disrupt. However, the literature also reveals </w:t>
+      </w:r>
+      <w:r>
+        <w:t>th</w:t>
+      </w:r>
+      <w:r>
+        <w:t>at there is still cloudiness when it comes to how coziness interacts with core gameplay structures.</w:t>
+      </w:r>
+    </w:p>
+    <w:p>
+      <w:r>
+        <w:t xml:space="preserve">An issue that </w:t>
+      </w:r>
+      <w:r>
+        <w:t>arises</w:t>
+      </w:r>
+      <w:r>
+        <w:t xml:space="preserve"> from </w:t>
+      </w:r>
+      <w:r>
+        <w:t>the review was the term “cozy” being inconsistent in definition. With (</w:t>
+      </w:r>
+      <w:r>
+        <w:rPr>
+          <w:highlight w:val="yellow"/>
+        </w:rPr>
+        <w:t>INSERT BOUDREAU</w:t>
+      </w:r>
+      <w:r>
+        <w:t>), it</w:t>
+      </w:r>
+      <w:r>
+        <w:t xml:space="preserve"> conceptualised the idea that coziness is a social</w:t>
+      </w:r>
+      <w:r>
+        <w:t xml:space="preserve"> construct whereas (</w:t>
+      </w:r>
+      <w:r>
+        <w:rPr>
+          <w:highlight w:val="yellow"/>
+        </w:rPr>
+        <w:t>INSERT WAPPLING</w:t>
+      </w:r>
+      <w:r>
+        <w:t xml:space="preserve">) it approached </w:t>
+      </w:r>
+      <w:r>
+        <w:t>coziness as a set of mechanical design principles. Fang (</w:t>
+      </w:r>
+      <w:r>
+        <w:rPr>
+          <w:highlight w:val="yellow"/>
+        </w:rPr>
+        <w:t>INSERT FANG</w:t>
+      </w:r>
+      <w:r>
+        <w:t xml:space="preserve">) </w:t>
+      </w:r>
+      <w:r>
+        <w:t xml:space="preserve">treated coziness as a psychological state. </w:t>
+      </w:r>
+      <w:r>
+        <w:t>These definitions</w:t>
+      </w:r>
+      <w:r>
+        <w:t xml:space="preserve"> </w:t>
+      </w:r>
+      <w:r>
+        <w:t>lack</w:t>
+      </w:r>
+      <w:r>
+        <w:t xml:space="preserve"> consensus about wh</w:t>
+      </w:r>
+      <w:r>
+        <w:t>ether cosiness is a genre, aesthetic or an emotional state.</w:t>
+      </w:r>
+    </w:p>
+    <w:p>
+      <w:r>
+        <w:t xml:space="preserve">Another issue that arises from the review was that all studies highlight the </w:t>
+      </w:r>
+      <w:r>
+        <w:t xml:space="preserve">positive effect of cozy games without </w:t>
+      </w:r>
+      <w:r>
+        <w:t xml:space="preserve">critiques on the negative ramifications </w:t>
+      </w:r>
+      <w:r>
+        <w:t xml:space="preserve">such as diminishing interactivity or </w:t>
+      </w:r>
+      <w:r>
+        <w:t xml:space="preserve">loss of challenge from the increase in </w:t>
+      </w:r>
+      <w:r>
+        <w:t>pillars such as gentle pacing (</w:t>
+      </w:r>
+      <w:r>
+        <w:rPr>
+          <w:highlight w:val="yellow"/>
+        </w:rPr>
+        <w:t>INSERT</w:t>
+      </w:r>
+      <w:r>
+        <w:rPr>
+          <w:highlight w:val="yellow"/>
+        </w:rPr>
+        <w:t xml:space="preserve"> BOUDREAU</w:t>
+      </w:r>
+      <w:r>
+        <w:t>), low-stakes interaction (</w:t>
+      </w:r>
+      <w:r>
+        <w:rPr>
+          <w:highlight w:val="yellow"/>
+        </w:rPr>
+        <w:t>INSERT WAPPLING</w:t>
+      </w:r>
+      <w:r>
+        <w:t xml:space="preserve">) and </w:t>
+      </w:r>
+      <w:r>
+        <w:t>safety (</w:t>
+      </w:r>
+      <w:r>
+        <w:rPr>
+          <w:highlight w:val="yellow"/>
+        </w:rPr>
+        <w:t>INSERT FANGS</w:t>
       </w:r>
       <w:r>
         <w:t>)</w:t>
       </w:r>
       <w:r>
-        <w:t xml:space="preserve"> and </w:t>
-      </w:r>
-      <w:r>
-        <w:t>“</w:t>
-      </w:r>
-      <w:r>
-        <w:t>A Short Hike</w:t>
-      </w:r>
-      <w:r>
-        <w:t xml:space="preserve">” </w:t>
-      </w:r>
-      <w:r>
-        <w:t>(</w:t>
-      </w:r>
-      <w:r>
-        <w:rPr>
-          <w:highlight w:val="yellow"/>
-        </w:rPr>
-        <w:t>INSERT REFERENCE</w:t>
-      </w:r>
-      <w:r>
-        <w:t>)</w:t>
-      </w:r>
-      <w:r>
-        <w:t xml:space="preserve">, the author highlights common characteristics between each game such as the gentle pacing, safety and positive </w:t>
-      </w:r>
-      <w:r>
-        <w:t>reinforcement. The study argues that these features</w:t>
-      </w:r>
-      <w:r>
-        <w:t xml:space="preserve"> assist to shift the focus of the player from mechanics mastery to emotional comfort, aligning with the notion of “low-stakes</w:t>
-      </w:r>
-      <w:r>
-        <w:t xml:space="preserve"> interactivity”. While the thesis helps define structural pillars in design for cozy game identity, it also outlines the tension between comfort and challenge.</w:t>
-      </w:r>
-      <w:r>
-        <w:t xml:space="preserve"> This raises the question of </w:t>
-      </w:r>
-      <w:r>
-        <w:t>whether simplification dilutes a game’s identity.</w:t>
-      </w:r>
-    </w:p>
-    <w:p>
-      <w:pPr>
-        <w:pStyle w:val="Heading3"/>
-      </w:pPr>
-      <w:r>
-        <w:t>2.0.1.</w:t>
-      </w:r>
-      <w:r>
-        <w:t xml:space="preserve">3 </w:t>
-      </w:r>
-      <w:r>
-        <w:t>How COVID-19 Affected</w:t>
-      </w:r>
-      <w:r>
-        <w:t xml:space="preserve"> the Gaming Sphere</w:t>
-      </w:r>
-    </w:p>
-    <w:p>
-      <w:r>
-        <w:t>Fang’s thesis</w:t>
+        <w:t>.</w:t>
+      </w:r>
+    </w:p>
+    <w:p>
+      <w:r>
+        <w:t>These limitations reveal that there is a gap in understanding the balance between affective design and gameplay identity. While the existing literature</w:t>
       </w:r>
       <w:r>
         <w:t xml:space="preserve"> </w:t>
       </w:r>
       <w:r>
-        <w:t>(</w:t>
-      </w:r>
-      <w:r>
-        <w:rPr>
-          <w:highlight w:val="yellow"/>
-        </w:rPr>
-        <w:t>INSERT SOURCE HERE</w:t>
-      </w:r>
-      <w:r>
-        <w:t xml:space="preserve">) </w:t>
-      </w:r>
-      <w:r>
-        <w:t>analyse</w:t>
-      </w:r>
-      <w:r>
-        <w:t>d</w:t>
-      </w:r>
-      <w:r>
-        <w:t xml:space="preserve"> </w:t>
-      </w:r>
-      <w:r>
-        <w:t>how</w:t>
-      </w:r>
-      <w:r>
-        <w:t xml:space="preserve"> </w:t>
-      </w:r>
-      <w:r>
-        <w:t xml:space="preserve">cozy games </w:t>
-      </w:r>
-      <w:r>
-        <w:t>influenced the players</w:t>
-      </w:r>
-      <w:r>
-        <w:t>’</w:t>
-      </w:r>
-      <w:r>
-        <w:t xml:space="preserve"> well-being during the global pandemic “COVID-19”.</w:t>
-      </w:r>
-      <w:r>
-        <w:t xml:space="preserve"> The thesis found that</w:t>
-      </w:r>
-      <w:r>
-        <w:t xml:space="preserve"> </w:t>
-      </w:r>
-      <w:r>
-        <w:t xml:space="preserve">gaming during this </w:t>
-      </w:r>
-      <w:r>
-        <w:t>period</w:t>
-      </w:r>
-      <w:r>
-        <w:t xml:space="preserve"> </w:t>
-      </w:r>
-      <w:r>
-        <w:t xml:space="preserve">produced predominantly positive outcomes, </w:t>
-      </w:r>
-      <w:r>
-        <w:t>particularly in social connection and emotional health</w:t>
-      </w:r>
-      <w:r>
+        <w:t>defines</w:t>
+      </w:r>
+      <w:r>
+        <w:t xml:space="preserve"> the cozy aesthetic, none explicitly examine where coziness begins to erode the play structure of </w:t>
+      </w:r>
+      <w:r>
+        <w:t xml:space="preserve">gameplay. This study will seek to address the gap presented by exploring how design choices such as difficulty </w:t>
+      </w:r>
+      <w:r>
+        <w:t>determine the point which a cozy game may seize to lose its identity.</w:t>
+      </w:r>
+    </w:p>
+    <w:p>
+      <w:pPr>
+        <w:pStyle w:val="Heading2"/>
+      </w:pPr>
+      <w:bookmarkStart w:id="14" w:name="_Toc212714934"/>
+      <w:r>
+        <w:t>2.</w:t>
+      </w:r>
+      <w:r>
+        <w:t>2</w:t>
+      </w:r>
+      <w:r>
+        <w:t xml:space="preserve"> Project Justification</w:t>
+      </w:r>
+      <w:bookmarkEnd w:id="14"/>
+    </w:p>
+    <w:p>
+      <w:pPr>
+        <w:rPr>
+          <w:rFonts w:ascii="Arial" w:hAnsi="Arial" w:cs="Arial"/>
+        </w:rPr>
+      </w:pPr>
+      <w:r>
+        <w:rPr>
+          <w:rFonts w:ascii="Arial" w:hAnsi="Arial" w:cs="Arial"/>
+        </w:rPr>
+        <w:t xml:space="preserve">With the gap being established, this project aims to explore how difficulty affects the identity of cozy games and where the line begins to blur between the artifact </w:t>
+      </w:r>
+      <w:r>
+        <w:rPr>
+          <w:rFonts w:ascii="Arial" w:hAnsi="Arial" w:cs="Arial"/>
+        </w:rPr>
+        <w:t xml:space="preserve">being a game and a virtual experience. </w:t>
+      </w:r>
+      <w:r>
+        <w:rPr>
+          <w:rFonts w:ascii="Arial" w:hAnsi="Arial" w:cs="Arial"/>
+        </w:rPr>
+        <w:t xml:space="preserve">This project will assist the industry by </w:t>
+      </w:r>
+      <w:r>
+        <w:rPr>
+          <w:rFonts w:ascii="Arial" w:hAnsi="Arial" w:cs="Arial"/>
+        </w:rPr>
+        <w:t xml:space="preserve">analysing how difficulty </w:t>
+      </w:r>
+      <w:r>
+        <w:rPr>
+          <w:rFonts w:ascii="Arial" w:hAnsi="Arial" w:cs="Arial"/>
+        </w:rPr>
+        <w:t xml:space="preserve">affects balance of coziness and </w:t>
+      </w:r>
+      <w:r>
+        <w:rPr>
+          <w:rFonts w:ascii="Arial" w:hAnsi="Arial" w:cs="Arial"/>
+        </w:rPr>
+        <w:t>gameplay</w:t>
+      </w:r>
+      <w:r>
+        <w:rPr>
+          <w:rFonts w:ascii="Arial" w:hAnsi="Arial" w:cs="Arial"/>
+        </w:rPr>
+        <w:t xml:space="preserve"> whilst </w:t>
+      </w:r>
+      <w:r>
+        <w:rPr>
+          <w:rFonts w:ascii="Arial" w:hAnsi="Arial" w:cs="Arial"/>
+        </w:rPr>
+        <w:t>determining</w:t>
+      </w:r>
+      <w:r>
+        <w:rPr>
+          <w:rFonts w:ascii="Arial" w:hAnsi="Arial" w:cs="Arial"/>
+        </w:rPr>
+        <w:t xml:space="preserve"> the threshold at which cozy games begin to lose identity</w:t>
+      </w:r>
+      <w:r>
+        <w:rPr>
+          <w:rFonts w:ascii="Arial" w:hAnsi="Arial" w:cs="Arial"/>
+        </w:rPr>
         <w:t>.</w:t>
       </w:r>
-      <w:r>
-        <w:t xml:space="preserve"> </w:t>
-      </w:r>
-      <w:r>
-        <w:t xml:space="preserve">Through qualitative </w:t>
-      </w:r>
-      <w:r>
-        <w:t>interviews</w:t>
-      </w:r>
-      <w:r>
-        <w:t xml:space="preserve"> with Chinese international students, </w:t>
-      </w:r>
-      <w:r>
-        <w:t>Fang (</w:t>
-      </w:r>
-      <w:r>
-        <w:rPr>
-          <w:highlight w:val="yellow"/>
-        </w:rPr>
-        <w:t xml:space="preserve">INSERT SOURCE </w:t>
-      </w:r>
-      <w:r>
-        <w:rPr>
-          <w:highlight w:val="yellow"/>
-        </w:rPr>
-        <w:t>HERE</w:t>
-      </w:r>
-      <w:r>
-        <w:t>) demonstrates</w:t>
-      </w:r>
-      <w:r>
-        <w:t xml:space="preserve"> that cozy games </w:t>
-      </w:r>
-      <w:r>
-        <w:t>fostered</w:t>
-      </w:r>
-      <w:r>
-        <w:t xml:space="preserve"> a sense of emotional safety, belonging and cultural self-expression during the isolation period.</w:t>
-      </w:r>
-      <w:r>
-        <w:t xml:space="preserve"> </w:t>
-      </w:r>
-      <w:r>
-        <w:t>The thesis</w:t>
-      </w:r>
-      <w:r>
-        <w:t xml:space="preserve"> </w:t>
-      </w:r>
-      <w:r>
-        <w:t>applied</w:t>
-      </w:r>
-      <w:r>
-        <w:t xml:space="preserve"> the idea of Maslow’s hierarchy of </w:t>
-      </w:r>
-      <w:r>
-        <w:t>needs (</w:t>
-      </w:r>
-      <w:r>
-        <w:rPr>
-          <w:highlight w:val="yellow"/>
-        </w:rPr>
-        <w:t>INSERT SOURCE HERE</w:t>
-      </w:r>
-      <w:r>
-        <w:t xml:space="preserve">) </w:t>
-      </w:r>
-      <w:r>
-        <w:t xml:space="preserve">and General Strain Theory </w:t>
-      </w:r>
-      <w:r>
-        <w:t>(</w:t>
-      </w:r>
-      <w:r>
-        <w:rPr>
-          <w:highlight w:val="yellow"/>
-        </w:rPr>
-        <w:t>INSERT SOURCE HERE</w:t>
-      </w:r>
-      <w:r>
-        <w:t xml:space="preserve">) </w:t>
-      </w:r>
-      <w:r>
-        <w:t>to argue that cozy games</w:t>
-      </w:r>
-      <w:r>
-        <w:t xml:space="preserve"> functioned as </w:t>
-      </w:r>
-      <w:r>
-        <w:t>technologies for escapism and an effective coping mechanism</w:t>
-      </w:r>
-      <w:r>
-        <w:t xml:space="preserve">. </w:t>
-      </w:r>
-      <w:r>
-        <w:t>However</w:t>
-      </w:r>
-      <w:r>
-        <w:t xml:space="preserve">, </w:t>
-      </w:r>
-      <w:r>
-        <w:t xml:space="preserve">it positioned cozy games as a primary tool for psychological and social stability during this period. </w:t>
-      </w:r>
-      <w:r>
-        <w:t xml:space="preserve">As a result, Fang’s analysis highlighted the growing tension within the genre: as comfort and safety become main design goals, the interactive and ludic elements that </w:t>
-      </w:r>
-      <w:r>
-        <w:t xml:space="preserve">traditionally define games risk being overthrown. This tension </w:t>
-      </w:r>
-      <w:r>
-        <w:t>aligns directly with the overarching concern of determining where the balance lies between coziness and play</w:t>
-      </w:r>
-      <w:r>
-        <w:t>.</w:t>
-      </w:r>
-    </w:p>
-    <w:p>
-      <w:pPr>
-        <w:pStyle w:val="Heading2"/>
-      </w:pPr>
-      <w:bookmarkStart w:id="13" w:name="_Toc212714933"/>
-      <w:r>
-        <w:t>2.</w:t>
-      </w:r>
-      <w:r>
-        <w:t>1</w:t>
-      </w:r>
-      <w:r>
-        <w:t xml:space="preserve"> Critical Analysis and Gap Identification</w:t>
-      </w:r>
-      <w:bookmarkEnd w:id="13"/>
-    </w:p>
-    <w:p>
-      <w:pPr>
-        <w:pStyle w:val="Heading2"/>
-      </w:pPr>
-      <w:bookmarkStart w:id="14" w:name="_Toc212714934"/>
-      <w:r>
-        <w:t>2.</w:t>
-      </w:r>
-      <w:r>
-        <w:t>2</w:t>
-      </w:r>
-      <w:r>
-        <w:t xml:space="preserve"> Project Justification</w:t>
-      </w:r>
-      <w:bookmarkEnd w:id="14"/>
     </w:p>
     <w:p>
       <w:pPr>
@@ -4372,59 +4625,6 @@
     </w:p>
     <w:p>
       <w:pPr>
-        <w:numPr>
-          <w:ilvl w:val="0"/>
-          <w:numId w:val="1"/>
-        </w:numPr>
-        <w:rPr>
-          <w:rFonts w:ascii="Arial" w:hAnsi="Arial" w:cs="Arial"/>
-          <w:sz w:val="22"/>
-          <w:szCs w:val="22"/>
-        </w:rPr>
-      </w:pPr>
-      <w:r>
-        <w:rPr>
-          <w:rFonts w:ascii="Arial" w:hAnsi="Arial" w:cs="Arial"/>
-          <w:sz w:val="22"/>
-          <w:szCs w:val="22"/>
-        </w:rPr>
-        <w:t>This will measure the current difference between each genre being played in the current ag</w:t>
-      </w:r>
-      <w:r>
-        <w:rPr>
-          <w:rFonts w:ascii="Arial" w:hAnsi="Arial" w:cs="Arial"/>
-          <w:sz w:val="22"/>
-          <w:szCs w:val="22"/>
-        </w:rPr>
-        <w:t xml:space="preserve">e. With this, a conclusion will be made about why certain genres have either gone up or down in popularity </w:t>
-      </w:r>
-      <w:r>
-        <w:rPr>
-          <w:rFonts w:ascii="Arial" w:hAnsi="Arial" w:cs="Arial"/>
-          <w:sz w:val="22"/>
-          <w:szCs w:val="22"/>
-        </w:rPr>
-        <w:t xml:space="preserve">with correlation to the </w:t>
-      </w:r>
-      <w:r>
-        <w:rPr>
-          <w:rFonts w:ascii="Arial" w:hAnsi="Arial" w:cs="Arial"/>
-          <w:sz w:val="22"/>
-          <w:szCs w:val="22"/>
-        </w:rPr>
-        <w:t>period</w:t>
-      </w:r>
-      <w:r>
-        <w:rPr>
-          <w:rFonts w:ascii="Arial" w:hAnsi="Arial" w:cs="Arial"/>
-          <w:sz w:val="22"/>
-          <w:szCs w:val="22"/>
-        </w:rPr>
-        <w:t>.</w:t>
-      </w:r>
-    </w:p>
-    <w:p>
-      <w:pPr>
         <w:pStyle w:val="Heading3"/>
       </w:pPr>
       <w:bookmarkStart w:id="19" w:name="_Toc212714939"/>
@@ -4462,56 +4662,6 @@
     </w:p>
     <w:p>
       <w:pPr>
-        <w:numPr>
-          <w:ilvl w:val="0"/>
-          <w:numId w:val="1"/>
-        </w:numPr>
-        <w:rPr>
-          <w:rFonts w:ascii="Arial" w:hAnsi="Arial" w:cs="Arial"/>
-          <w:sz w:val="22"/>
-          <w:szCs w:val="22"/>
-        </w:rPr>
-      </w:pPr>
-      <w:r>
-        <w:rPr>
-          <w:rFonts w:ascii="Arial" w:hAnsi="Arial" w:cs="Arial"/>
-          <w:sz w:val="22"/>
-          <w:szCs w:val="22"/>
-        </w:rPr>
-        <w:t>This will identify the core pillars of the Cozy Game genre.</w:t>
-      </w:r>
-    </w:p>
-    <w:p>
-      <w:pPr>
-        <w:numPr>
-          <w:ilvl w:val="0"/>
-          <w:numId w:val="1"/>
-        </w:numPr>
-        <w:rPr>
-          <w:rFonts w:ascii="Arial" w:hAnsi="Arial" w:cs="Arial"/>
-          <w:sz w:val="22"/>
-          <w:szCs w:val="22"/>
-        </w:rPr>
-      </w:pPr>
-      <w:r>
-        <w:rPr>
-          <w:rFonts w:ascii="Arial" w:hAnsi="Arial" w:cs="Arial"/>
-          <w:sz w:val="22"/>
-          <w:szCs w:val="22"/>
-        </w:rPr>
-        <w:t xml:space="preserve">After definition of core pillars, this will </w:t>
-      </w:r>
-      <w:r>
-        <w:rPr>
-          <w:rFonts w:ascii="Arial" w:hAnsi="Arial" w:cs="Arial"/>
-          <w:sz w:val="22"/>
-          <w:szCs w:val="22"/>
-        </w:rPr>
-        <w:t>focus on the importance of said pillars to the identification of the Cozy Game genre.</w:t>
-      </w:r>
-    </w:p>
-    <w:p>
-      <w:pPr>
         <w:pStyle w:val="Heading3"/>
       </w:pPr>
       <w:bookmarkStart w:id="20" w:name="_Toc212714940"/>
@@ -4531,43 +4681,6 @@
     </w:p>
     <w:p>
       <w:pPr>
-        <w:numPr>
-          <w:ilvl w:val="0"/>
-          <w:numId w:val="1"/>
-        </w:numPr>
-        <w:rPr>
-          <w:rFonts w:ascii="Arial" w:hAnsi="Arial" w:cs="Arial"/>
-          <w:sz w:val="22"/>
-          <w:szCs w:val="22"/>
-        </w:rPr>
-      </w:pPr>
-      <w:r>
-        <w:rPr>
-          <w:rFonts w:ascii="Arial" w:hAnsi="Arial" w:cs="Arial"/>
-          <w:sz w:val="22"/>
-          <w:szCs w:val="22"/>
-        </w:rPr>
-        <w:t xml:space="preserve">This will define what </w:t>
-      </w:r>
-      <w:r>
-        <w:rPr>
-          <w:rFonts w:ascii="Arial" w:hAnsi="Arial" w:cs="Arial"/>
-          <w:sz w:val="22"/>
-          <w:szCs w:val="22"/>
-        </w:rPr>
-        <w:t>makes a product a virtual experience rather than a game</w:t>
-      </w:r>
-      <w:r>
-        <w:rPr>
-          <w:rFonts w:ascii="Arial" w:hAnsi="Arial" w:cs="Arial"/>
-          <w:sz w:val="22"/>
-          <w:szCs w:val="22"/>
-        </w:rPr>
-        <w:t>.</w:t>
-      </w:r>
-    </w:p>
-    <w:p>
-      <w:pPr>
         <w:pStyle w:val="Heading3"/>
       </w:pPr>
       <w:bookmarkStart w:id="21" w:name="_Toc212714941"/>
@@ -4581,42 +4694,6 @@
     </w:p>
     <w:p>
       <w:pPr>
-        <w:numPr>
-          <w:ilvl w:val="0"/>
-          <w:numId w:val="1"/>
-        </w:numPr>
-        <w:rPr>
-          <w:rFonts w:ascii="Arial" w:hAnsi="Arial" w:cs="Arial"/>
-          <w:sz w:val="22"/>
-          <w:szCs w:val="22"/>
-        </w:rPr>
-      </w:pPr>
-      <w:r>
-        <w:rPr>
-          <w:rFonts w:ascii="Arial" w:hAnsi="Arial" w:cs="Arial"/>
-          <w:sz w:val="22"/>
-          <w:szCs w:val="22"/>
-        </w:rPr>
-        <w:t>This will also focus on the different forms of difficulty present within a game, and which forms are mainly found within the Cozy Game genre.</w:t>
-      </w:r>
-    </w:p>
-    <w:p>
-      <w:pPr>
-        <w:numPr>
-          <w:ilvl w:val="0"/>
-          <w:numId w:val="1"/>
-        </w:numPr>
-        <w:rPr>
-          <w:rFonts w:ascii="Arial" w:hAnsi="Arial" w:cs="Arial"/>
-          <w:b/>
-          <w:bCs/>
-          <w:sz w:val="22"/>
-          <w:szCs w:val="22"/>
-        </w:rPr>
-      </w:pPr>
-    </w:p>
-    <w:p>
-      <w:pPr>
         <w:pStyle w:val="Heading3"/>
       </w:pPr>
       <w:bookmarkStart w:id="22" w:name="_Toc212714942"/>
@@ -4654,35 +4731,6 @@
         <w:t>affects the coziness of a game</w:t>
       </w:r>
       <w:bookmarkEnd w:id="22"/>
-    </w:p>
-    <w:p>
-      <w:pPr>
-        <w:numPr>
-          <w:ilvl w:val="0"/>
-          <w:numId w:val="1"/>
-        </w:numPr>
-        <w:rPr>
-          <w:rFonts w:ascii="Arial" w:hAnsi="Arial" w:cs="Arial"/>
-          <w:sz w:val="22"/>
-          <w:szCs w:val="22"/>
-        </w:rPr>
-      </w:pPr>
-      <w:r>
-        <w:rPr>
-          <w:rFonts w:ascii="Arial" w:hAnsi="Arial" w:cs="Arial"/>
-          <w:sz w:val="22"/>
-          <w:szCs w:val="22"/>
-        </w:rPr>
-        <w:t xml:space="preserve">Explore Gameplay </w:t>
-      </w:r>
-      <w:r>
-        <w:rPr>
-          <w:rFonts w:ascii="Arial" w:hAnsi="Arial" w:cs="Arial"/>
-          <w:sz w:val="22"/>
-          <w:szCs w:val="22"/>
-        </w:rPr>
-        <w:t>Consistency</w:t>
-      </w:r>
     </w:p>
     <w:p>
       <w:pPr>
@@ -5130,7 +5178,13 @@
         <w:rPr>
           <w:highlight w:val="yellow"/>
         </w:rPr>
-        <w:t>GET A REFERENCE FOR THIS</w:t>
+        <w:t>INSERT</w:t>
+      </w:r>
+      <w:r>
+        <w:rPr>
+          <w:highlight w:val="yellow"/>
+        </w:rPr>
+        <w:t xml:space="preserve"> REFERENCE FOR THIS</w:t>
       </w:r>
       <w:r>
         <w:t>)</w:t>
@@ -5371,6 +5425,14 @@
       <w:bookmarkEnd w:id="29"/>
     </w:p>
     <w:p>
+      <w:pPr>
+        <w:rPr>
+          <w:sz w:val="16"/>
+          <w:szCs w:val="16"/>
+        </w:rPr>
+      </w:pPr>
+    </w:p>
+    <w:p>
       <w:r>
         <w:t>The Kanban board</w:t>
       </w:r>
@@ -5548,13 +5610,6 @@
     </w:p>
     <w:p>
       <w:pPr>
-        <w:rPr>
-          <w:rFonts w:ascii="Arial" w:hAnsi="Arial" w:cs="Arial"/>
-        </w:rPr>
-      </w:pPr>
-    </w:p>
-    <w:p>
-      <w:pPr>
         <w:pStyle w:val="Heading1"/>
       </w:pPr>
       <w:bookmarkStart w:id="31" w:name="_Toc212714949"/>
@@ -5656,6 +5711,7 @@
       </w:r>
       <w:bookmarkEnd w:id="33"/>
     </w:p>
+    <w:p/>
     <w:p/>
     <w:tbl>
       <w:tblPr>
@@ -9079,6 +9135,27 @@
 </file>
 
 <file path=customXml/item1.xml><?xml version="1.0" encoding="utf-8"?>
+<?mso-contentType ?>
+<FormTemplates xmlns="http://schemas.microsoft.com/sharepoint/v3/contenttype/forms">
+  <Display>DocumentLibraryForm</Display>
+  <Edit>DocumentLibraryForm</Edit>
+  <New>DocumentLibraryForm</New>
+</FormTemplates>
+</file>
+
+<file path=customXml/item2.xml><?xml version="1.0" encoding="utf-8"?>
+<b:Sources xmlns:b="http://schemas.openxmlformats.org/officeDocument/2006/bibliography" xmlns="http://schemas.openxmlformats.org/officeDocument/2006/bibliography" SelectedStyle="\APASixthEditionOfficeOnline.xsl" StyleName="APA" Version="6"/>
+</file>
+
+<file path=customXml/item3.xml><?xml version="1.0" encoding="utf-8"?>
+<p:properties xmlns:p="http://schemas.microsoft.com/office/2006/metadata/properties" xmlns:xsi="http://www.w3.org/2001/XMLSchema-instance" xmlns:pc="http://schemas.microsoft.com/office/infopath/2007/PartnerControls">
+  <documentManagement>
+    <_activity xmlns="4e6bee01-fae3-4e1c-8f1a-9ed0fe9197f3" xsi:nil="true"/>
+  </documentManagement>
+</p:properties>
+</file>
+
+<file path=customXml/item4.xml><?xml version="1.0" encoding="utf-8"?>
 <ct:contentTypeSchema xmlns:ct="http://schemas.microsoft.com/office/2006/metadata/contentType" xmlns:ma="http://schemas.microsoft.com/office/2006/metadata/properties/metaAttributes" ct:_="" ma:_="" ma:contentTypeName="Document" ma:contentTypeID="0x0101008F0F6E24CBBDF2489BB0C7D787BF1FA9" ma:contentTypeVersion="15" ma:contentTypeDescription="Create a new document." ma:contentTypeScope="" ma:versionID="2d4b1107e0bcd24d879f2e81b4ffe2f7">
   <xsd:schema xmlns:xsd="http://www.w3.org/2001/XMLSchema" xmlns:xs="http://www.w3.org/2001/XMLSchema" xmlns:p="http://schemas.microsoft.com/office/2006/metadata/properties" xmlns:ns3="4e6bee01-fae3-4e1c-8f1a-9ed0fe9197f3" xmlns:ns4="9ebee74b-6c09-439e-a20a-fc6d1b49bd2d" targetNamespace="http://schemas.microsoft.com/office/2006/metadata/properties" ma:root="true" ma:fieldsID="5cc5db8e17a87248a928f297a097d818" ns3:_="" ns4:_="">
     <xsd:import namespace="4e6bee01-fae3-4e1c-8f1a-9ed0fe9197f3"/>
@@ -9311,28 +9388,33 @@
 </ct:contentTypeSchema>
 </file>
 
-<file path=customXml/item2.xml><?xml version="1.0" encoding="utf-8"?>
-<p:properties xmlns:p="http://schemas.microsoft.com/office/2006/metadata/properties" xmlns:xsi="http://www.w3.org/2001/XMLSchema-instance" xmlns:pc="http://schemas.microsoft.com/office/infopath/2007/PartnerControls">
-  <documentManagement>
-    <_activity xmlns="4e6bee01-fae3-4e1c-8f1a-9ed0fe9197f3" xsi:nil="true"/>
-  </documentManagement>
-</p:properties>
+<file path=customXml/itemProps1.xml><?xml version="1.0" encoding="utf-8"?>
+<ds:datastoreItem xmlns:ds="http://schemas.openxmlformats.org/officeDocument/2006/customXml" ds:itemID="{E4A5EDD7-4E6F-4D6E-A621-24883E4CA807}">
+  <ds:schemaRefs>
+    <ds:schemaRef ds:uri="http://schemas.microsoft.com/sharepoint/v3/contenttype/forms"/>
+  </ds:schemaRefs>
+</ds:datastoreItem>
 </file>
 
-<file path=customXml/item3.xml><?xml version="1.0" encoding="utf-8"?>
-<b:Sources xmlns:b="http://schemas.openxmlformats.org/officeDocument/2006/bibliography" xmlns="http://schemas.openxmlformats.org/officeDocument/2006/bibliography" SelectedStyle="\APASixthEditionOfficeOnline.xsl" StyleName="APA" Version="6"/>
+<file path=customXml/itemProps2.xml><?xml version="1.0" encoding="utf-8"?>
+<ds:datastoreItem xmlns:ds="http://schemas.openxmlformats.org/officeDocument/2006/customXml" ds:itemID="{01737935-5D60-4040-8892-9E4074313170}">
+  <ds:schemaRefs>
+    <ds:schemaRef ds:uri="http://schemas.openxmlformats.org/officeDocument/2006/bibliography"/>
+  </ds:schemaRefs>
+</ds:datastoreItem>
 </file>
 
-<file path=customXml/item4.xml><?xml version="1.0" encoding="utf-8"?>
-<?mso-contentType ?>
-<FormTemplates xmlns="http://schemas.microsoft.com/sharepoint/v3/contenttype/forms">
-  <Display>DocumentLibraryForm</Display>
-  <Edit>DocumentLibraryForm</Edit>
-  <New>DocumentLibraryForm</New>
-</FormTemplates>
+<file path=customXml/itemProps3.xml><?xml version="1.0" encoding="utf-8"?>
+<ds:datastoreItem xmlns:ds="http://schemas.openxmlformats.org/officeDocument/2006/customXml" ds:itemID="{427E592C-BA00-4E9F-856E-27CA4AE42C28}">
+  <ds:schemaRefs>
+    <ds:schemaRef ds:uri="http://schemas.microsoft.com/office/2006/metadata/properties"/>
+    <ds:schemaRef ds:uri="http://schemas.microsoft.com/office/infopath/2007/PartnerControls"/>
+    <ds:schemaRef ds:uri="4e6bee01-fae3-4e1c-8f1a-9ed0fe9197f3"/>
+  </ds:schemaRefs>
+</ds:datastoreItem>
 </file>
 
-<file path=customXml/itemProps1.xml><?xml version="1.0" encoding="utf-8"?>
+<file path=customXml/itemProps4.xml><?xml version="1.0" encoding="utf-8"?>
 <ds:datastoreItem xmlns:ds="http://schemas.openxmlformats.org/officeDocument/2006/customXml" ds:itemID="{71FFA508-172B-43AC-84A2-26545FBF7306}">
   <ds:schemaRefs>
     <ds:schemaRef ds:uri="http://schemas.microsoft.com/office/2006/metadata/contentType"/>
@@ -9349,30 +9431,4 @@
     <ds:schemaRef ds:uri="http://schemas.microsoft.com/internal/obd"/>
   </ds:schemaRefs>
 </ds:datastoreItem>
-</file>
-
-<file path=customXml/itemProps2.xml><?xml version="1.0" encoding="utf-8"?>
-<ds:datastoreItem xmlns:ds="http://schemas.openxmlformats.org/officeDocument/2006/customXml" ds:itemID="{427E592C-BA00-4E9F-856E-27CA4AE42C28}">
-  <ds:schemaRefs>
-    <ds:schemaRef ds:uri="http://schemas.microsoft.com/office/2006/metadata/properties"/>
-    <ds:schemaRef ds:uri="http://schemas.microsoft.com/office/infopath/2007/PartnerControls"/>
-    <ds:schemaRef ds:uri="4e6bee01-fae3-4e1c-8f1a-9ed0fe9197f3"/>
-  </ds:schemaRefs>
-</ds:datastoreItem>
-</file>
-
-<file path=customXml/itemProps3.xml><?xml version="1.0" encoding="utf-8"?>
-<ds:datastoreItem xmlns:ds="http://schemas.openxmlformats.org/officeDocument/2006/customXml" ds:itemID="{01737935-5D60-4040-8892-9E4074313170}">
-  <ds:schemaRefs>
-    <ds:schemaRef ds:uri="http://schemas.openxmlformats.org/officeDocument/2006/bibliography"/>
-  </ds:schemaRefs>
-</ds:datastoreItem>
-</file>
-
-<file path=customXml/itemProps4.xml><?xml version="1.0" encoding="utf-8"?>
-<ds:datastoreItem xmlns:ds="http://schemas.openxmlformats.org/officeDocument/2006/customXml" ds:itemID="{E4A5EDD7-4E6F-4D6E-A621-24883E4CA807}">
-  <ds:schemaRefs>
-    <ds:schemaRef ds:uri="http://schemas.microsoft.com/sharepoint/v3/contenttype/forms"/>
-  </ds:schemaRefs>
-</ds:datastoreItem>
 </file>
</xml_diff>